<commit_message>
Rebrand platform to Suahco4, replace emoji with SVG icons, show all receipt templates
- Rename Greater Praise School System -> Suahco4 across platform, builders and generators; contact -> 0778662590, prefix -> SUAHCO4-
- Replace emoji icons with inline SVG icons (home cards + Receipt Book Generator panel)
- Add a templates gallery to the platform home: simple, itemized, school-fees and horizontal books (PDF + Word), all-in-one file, and the Receipt Book Generator
- Regenerate all receipt PDFs/DOCXs, samples and previews with the new branding
- New Suahco4 wordmark logo (make_logo.py -> logo.png, logo_b64.txt)

Co-authored-by: arena-agent <297053741+arena-agent@users.noreply.github.com>
</commit_message>
<xml_diff>
--- a/receipt_book.docx
+++ b/receipt_book.docx
@@ -32,7 +32,7 @@
             <w:r>
               <w:drawing>
                 <wp:inline xmlns:a="http://schemas.openxmlformats.org/drawingml/2006/main" xmlns:pic="http://schemas.openxmlformats.org/drawingml/2006/picture">
-                  <wp:extent cx="504000" cy="340541"/>
+                  <wp:extent cx="504000" cy="216000"/>
                   <wp:docPr id="1" name="Picture 1"/>
                   <wp:cNvGraphicFramePr>
                     <a:graphicFrameLocks noChangeAspect="1"/>
@@ -53,7 +53,7 @@
                         <pic:spPr>
                           <a:xfrm>
                             <a:off x="0" y="0"/>
-                            <a:ext cx="504000" cy="340541"/>
+                            <a:ext cx="504000" cy="216000"/>
                           </a:xfrm>
                           <a:prstGeom prst="rect"/>
                         </pic:spPr>
@@ -73,7 +73,7 @@
                 <w:b/>
                 <w:sz w:val="26"/>
               </w:rPr>
-              <w:t>GREATER PRAISE SCHOOL SYSTEM</w:t>
+              <w:t>Suahco4</w:t>
             </w:r>
           </w:p>
           <w:p>
@@ -97,7 +97,7 @@
                 <w:b w:val="0"/>
                 <w:sz w:val="11"/>
               </w:rPr>
-              <w:t>Phone: 0775508030/0771241726 | Email:</w:t>
+              <w:t>Phone: 0778662590 | Email:</w:t>
             </w:r>
           </w:p>
           <w:p>
@@ -119,7 +119,7 @@
                 <w:color w:val="B8121B"/>
                 <w:sz w:val="16"/>
               </w:rPr>
-              <w:t>Receipt No: GPSS-061</w:t>
+              <w:t>Receipt No: SUAHCO4-061</w:t>
             </w:r>
             <w:r>
               <w:rPr>
@@ -317,7 +317,7 @@
             <w:r>
               <w:drawing>
                 <wp:inline xmlns:a="http://schemas.openxmlformats.org/drawingml/2006/main" xmlns:pic="http://schemas.openxmlformats.org/drawingml/2006/picture">
-                  <wp:extent cx="504000" cy="340541"/>
+                  <wp:extent cx="504000" cy="216000"/>
                   <wp:docPr id="2" name="Picture 2"/>
                   <wp:cNvGraphicFramePr>
                     <a:graphicFrameLocks noChangeAspect="1"/>
@@ -338,7 +338,7 @@
                         <pic:spPr>
                           <a:xfrm>
                             <a:off x="0" y="0"/>
-                            <a:ext cx="504000" cy="340541"/>
+                            <a:ext cx="504000" cy="216000"/>
                           </a:xfrm>
                           <a:prstGeom prst="rect"/>
                         </pic:spPr>
@@ -358,7 +358,7 @@
                 <w:b/>
                 <w:sz w:val="26"/>
               </w:rPr>
-              <w:t>GREATER PRAISE SCHOOL SYSTEM</w:t>
+              <w:t>Suahco4</w:t>
             </w:r>
           </w:p>
           <w:p>
@@ -382,7 +382,7 @@
                 <w:b w:val="0"/>
                 <w:sz w:val="11"/>
               </w:rPr>
-              <w:t>Phone: 0775508030/0771241726 | Email:</w:t>
+              <w:t>Phone: 0778662590 | Email:</w:t>
             </w:r>
           </w:p>
           <w:p>
@@ -404,7 +404,7 @@
                 <w:color w:val="B8121B"/>
                 <w:sz w:val="16"/>
               </w:rPr>
-              <w:t>Receipt No: GPSS-062</w:t>
+              <w:t>Receipt No: SUAHCO4-062</w:t>
             </w:r>
             <w:r>
               <w:rPr>
@@ -602,7 +602,7 @@
             <w:r>
               <w:drawing>
                 <wp:inline xmlns:a="http://schemas.openxmlformats.org/drawingml/2006/main" xmlns:pic="http://schemas.openxmlformats.org/drawingml/2006/picture">
-                  <wp:extent cx="504000" cy="340541"/>
+                  <wp:extent cx="504000" cy="216000"/>
                   <wp:docPr id="3" name="Picture 3"/>
                   <wp:cNvGraphicFramePr>
                     <a:graphicFrameLocks noChangeAspect="1"/>
@@ -623,7 +623,7 @@
                         <pic:spPr>
                           <a:xfrm>
                             <a:off x="0" y="0"/>
-                            <a:ext cx="504000" cy="340541"/>
+                            <a:ext cx="504000" cy="216000"/>
                           </a:xfrm>
                           <a:prstGeom prst="rect"/>
                         </pic:spPr>
@@ -643,7 +643,7 @@
                 <w:b/>
                 <w:sz w:val="26"/>
               </w:rPr>
-              <w:t>GREATER PRAISE SCHOOL SYSTEM</w:t>
+              <w:t>Suahco4</w:t>
             </w:r>
           </w:p>
           <w:p>
@@ -667,7 +667,7 @@
                 <w:b w:val="0"/>
                 <w:sz w:val="11"/>
               </w:rPr>
-              <w:t>Phone: 0775508030/0771241726 | Email:</w:t>
+              <w:t>Phone: 0778662590 | Email:</w:t>
             </w:r>
           </w:p>
           <w:p>
@@ -689,7 +689,7 @@
                 <w:color w:val="B8121B"/>
                 <w:sz w:val="16"/>
               </w:rPr>
-              <w:t>Receipt No: GPSS-063</w:t>
+              <w:t>Receipt No: SUAHCO4-063</w:t>
             </w:r>
             <w:r>
               <w:rPr>
@@ -883,7 +883,7 @@
             <w:r>
               <w:drawing>
                 <wp:inline xmlns:a="http://schemas.openxmlformats.org/drawingml/2006/main" xmlns:pic="http://schemas.openxmlformats.org/drawingml/2006/picture">
-                  <wp:extent cx="504000" cy="340541"/>
+                  <wp:extent cx="504000" cy="216000"/>
                   <wp:docPr id="4" name="Picture 4"/>
                   <wp:cNvGraphicFramePr>
                     <a:graphicFrameLocks noChangeAspect="1"/>
@@ -904,7 +904,7 @@
                         <pic:spPr>
                           <a:xfrm>
                             <a:off x="0" y="0"/>
-                            <a:ext cx="504000" cy="340541"/>
+                            <a:ext cx="504000" cy="216000"/>
                           </a:xfrm>
                           <a:prstGeom prst="rect"/>
                         </pic:spPr>
@@ -924,7 +924,7 @@
                 <w:b/>
                 <w:sz w:val="26"/>
               </w:rPr>
-              <w:t>GREATER PRAISE SCHOOL SYSTEM</w:t>
+              <w:t>Suahco4</w:t>
             </w:r>
           </w:p>
           <w:p>
@@ -948,7 +948,7 @@
                 <w:b w:val="0"/>
                 <w:sz w:val="11"/>
               </w:rPr>
-              <w:t>Phone: 0775508030/0771241726 | Email:</w:t>
+              <w:t>Phone: 0778662590 | Email:</w:t>
             </w:r>
           </w:p>
           <w:p>
@@ -970,7 +970,7 @@
                 <w:color w:val="B8121B"/>
                 <w:sz w:val="16"/>
               </w:rPr>
-              <w:t>Receipt No: GPSS-061</w:t>
+              <w:t>Receipt No: SUAHCO4-061</w:t>
             </w:r>
             <w:r>
               <w:rPr>
@@ -1168,7 +1168,7 @@
             <w:r>
               <w:drawing>
                 <wp:inline xmlns:a="http://schemas.openxmlformats.org/drawingml/2006/main" xmlns:pic="http://schemas.openxmlformats.org/drawingml/2006/picture">
-                  <wp:extent cx="504000" cy="340541"/>
+                  <wp:extent cx="504000" cy="216000"/>
                   <wp:docPr id="5" name="Picture 5"/>
                   <wp:cNvGraphicFramePr>
                     <a:graphicFrameLocks noChangeAspect="1"/>
@@ -1189,7 +1189,7 @@
                         <pic:spPr>
                           <a:xfrm>
                             <a:off x="0" y="0"/>
-                            <a:ext cx="504000" cy="340541"/>
+                            <a:ext cx="504000" cy="216000"/>
                           </a:xfrm>
                           <a:prstGeom prst="rect"/>
                         </pic:spPr>
@@ -1209,7 +1209,7 @@
                 <w:b/>
                 <w:sz w:val="26"/>
               </w:rPr>
-              <w:t>GREATER PRAISE SCHOOL SYSTEM</w:t>
+              <w:t>Suahco4</w:t>
             </w:r>
           </w:p>
           <w:p>
@@ -1233,7 +1233,7 @@
                 <w:b w:val="0"/>
                 <w:sz w:val="11"/>
               </w:rPr>
-              <w:t>Phone: 0775508030/0771241726 | Email:</w:t>
+              <w:t>Phone: 0778662590 | Email:</w:t>
             </w:r>
           </w:p>
           <w:p>
@@ -1255,7 +1255,7 @@
                 <w:color w:val="B8121B"/>
                 <w:sz w:val="16"/>
               </w:rPr>
-              <w:t>Receipt No: GPSS-062</w:t>
+              <w:t>Receipt No: SUAHCO4-062</w:t>
             </w:r>
             <w:r>
               <w:rPr>
@@ -1453,7 +1453,7 @@
             <w:r>
               <w:drawing>
                 <wp:inline xmlns:a="http://schemas.openxmlformats.org/drawingml/2006/main" xmlns:pic="http://schemas.openxmlformats.org/drawingml/2006/picture">
-                  <wp:extent cx="504000" cy="340541"/>
+                  <wp:extent cx="504000" cy="216000"/>
                   <wp:docPr id="6" name="Picture 6"/>
                   <wp:cNvGraphicFramePr>
                     <a:graphicFrameLocks noChangeAspect="1"/>
@@ -1474,7 +1474,7 @@
                         <pic:spPr>
                           <a:xfrm>
                             <a:off x="0" y="0"/>
-                            <a:ext cx="504000" cy="340541"/>
+                            <a:ext cx="504000" cy="216000"/>
                           </a:xfrm>
                           <a:prstGeom prst="rect"/>
                         </pic:spPr>
@@ -1494,7 +1494,7 @@
                 <w:b/>
                 <w:sz w:val="26"/>
               </w:rPr>
-              <w:t>GREATER PRAISE SCHOOL SYSTEM</w:t>
+              <w:t>Suahco4</w:t>
             </w:r>
           </w:p>
           <w:p>
@@ -1518,7 +1518,7 @@
                 <w:b w:val="0"/>
                 <w:sz w:val="11"/>
               </w:rPr>
-              <w:t>Phone: 0775508030/0771241726 | Email:</w:t>
+              <w:t>Phone: 0778662590 | Email:</w:t>
             </w:r>
           </w:p>
           <w:p>
@@ -1540,7 +1540,7 @@
                 <w:color w:val="B8121B"/>
                 <w:sz w:val="16"/>
               </w:rPr>
-              <w:t>Receipt No: GPSS-063</w:t>
+              <w:t>Receipt No: SUAHCO4-063</w:t>
             </w:r>
             <w:r>
               <w:rPr>
@@ -1734,7 +1734,7 @@
             <w:r>
               <w:drawing>
                 <wp:inline xmlns:a="http://schemas.openxmlformats.org/drawingml/2006/main" xmlns:pic="http://schemas.openxmlformats.org/drawingml/2006/picture">
-                  <wp:extent cx="504000" cy="340541"/>
+                  <wp:extent cx="504000" cy="216000"/>
                   <wp:docPr id="7" name="Picture 7"/>
                   <wp:cNvGraphicFramePr>
                     <a:graphicFrameLocks noChangeAspect="1"/>
@@ -1755,7 +1755,7 @@
                         <pic:spPr>
                           <a:xfrm>
                             <a:off x="0" y="0"/>
-                            <a:ext cx="504000" cy="340541"/>
+                            <a:ext cx="504000" cy="216000"/>
                           </a:xfrm>
                           <a:prstGeom prst="rect"/>
                         </pic:spPr>
@@ -1775,7 +1775,7 @@
                 <w:b/>
                 <w:sz w:val="26"/>
               </w:rPr>
-              <w:t>GREATER PRAISE SCHOOL SYSTEM</w:t>
+              <w:t>Suahco4</w:t>
             </w:r>
           </w:p>
           <w:p>
@@ -1799,7 +1799,7 @@
                 <w:b w:val="0"/>
                 <w:sz w:val="11"/>
               </w:rPr>
-              <w:t>Phone: 0775508030/0771241726 | Email:</w:t>
+              <w:t>Phone: 0778662590 | Email:</w:t>
             </w:r>
           </w:p>
           <w:p>
@@ -1821,7 +1821,7 @@
                 <w:color w:val="B8121B"/>
                 <w:sz w:val="16"/>
               </w:rPr>
-              <w:t>Receipt No: GPSS-064</w:t>
+              <w:t>Receipt No: SUAHCO4-064</w:t>
             </w:r>
             <w:r>
               <w:rPr>
@@ -2019,7 +2019,7 @@
             <w:r>
               <w:drawing>
                 <wp:inline xmlns:a="http://schemas.openxmlformats.org/drawingml/2006/main" xmlns:pic="http://schemas.openxmlformats.org/drawingml/2006/picture">
-                  <wp:extent cx="504000" cy="340541"/>
+                  <wp:extent cx="504000" cy="216000"/>
                   <wp:docPr id="8" name="Picture 8"/>
                   <wp:cNvGraphicFramePr>
                     <a:graphicFrameLocks noChangeAspect="1"/>
@@ -2040,7 +2040,7 @@
                         <pic:spPr>
                           <a:xfrm>
                             <a:off x="0" y="0"/>
-                            <a:ext cx="504000" cy="340541"/>
+                            <a:ext cx="504000" cy="216000"/>
                           </a:xfrm>
                           <a:prstGeom prst="rect"/>
                         </pic:spPr>
@@ -2060,7 +2060,7 @@
                 <w:b/>
                 <w:sz w:val="26"/>
               </w:rPr>
-              <w:t>GREATER PRAISE SCHOOL SYSTEM</w:t>
+              <w:t>Suahco4</w:t>
             </w:r>
           </w:p>
           <w:p>
@@ -2084,7 +2084,7 @@
                 <w:b w:val="0"/>
                 <w:sz w:val="11"/>
               </w:rPr>
-              <w:t>Phone: 0775508030/0771241726 | Email:</w:t>
+              <w:t>Phone: 0778662590 | Email:</w:t>
             </w:r>
           </w:p>
           <w:p>
@@ -2106,7 +2106,7 @@
                 <w:color w:val="B8121B"/>
                 <w:sz w:val="16"/>
               </w:rPr>
-              <w:t>Receipt No: GPSS-065</w:t>
+              <w:t>Receipt No: SUAHCO4-065</w:t>
             </w:r>
             <w:r>
               <w:rPr>
@@ -2304,7 +2304,7 @@
             <w:r>
               <w:drawing>
                 <wp:inline xmlns:a="http://schemas.openxmlformats.org/drawingml/2006/main" xmlns:pic="http://schemas.openxmlformats.org/drawingml/2006/picture">
-                  <wp:extent cx="504000" cy="340541"/>
+                  <wp:extent cx="504000" cy="216000"/>
                   <wp:docPr id="9" name="Picture 9"/>
                   <wp:cNvGraphicFramePr>
                     <a:graphicFrameLocks noChangeAspect="1"/>
@@ -2325,7 +2325,7 @@
                         <pic:spPr>
                           <a:xfrm>
                             <a:off x="0" y="0"/>
-                            <a:ext cx="504000" cy="340541"/>
+                            <a:ext cx="504000" cy="216000"/>
                           </a:xfrm>
                           <a:prstGeom prst="rect"/>
                         </pic:spPr>
@@ -2345,7 +2345,7 @@
                 <w:b/>
                 <w:sz w:val="26"/>
               </w:rPr>
-              <w:t>GREATER PRAISE SCHOOL SYSTEM</w:t>
+              <w:t>Suahco4</w:t>
             </w:r>
           </w:p>
           <w:p>
@@ -2369,7 +2369,7 @@
                 <w:b w:val="0"/>
                 <w:sz w:val="11"/>
               </w:rPr>
-              <w:t>Phone: 0775508030/0771241726 | Email:</w:t>
+              <w:t>Phone: 0778662590 | Email:</w:t>
             </w:r>
           </w:p>
           <w:p>
@@ -2391,7 +2391,7 @@
                 <w:color w:val="B8121B"/>
                 <w:sz w:val="16"/>
               </w:rPr>
-              <w:t>Receipt No: GPSS-066</w:t>
+              <w:t>Receipt No: SUAHCO4-066</w:t>
             </w:r>
             <w:r>
               <w:rPr>
@@ -2585,7 +2585,7 @@
             <w:r>
               <w:drawing>
                 <wp:inline xmlns:a="http://schemas.openxmlformats.org/drawingml/2006/main" xmlns:pic="http://schemas.openxmlformats.org/drawingml/2006/picture">
-                  <wp:extent cx="504000" cy="340541"/>
+                  <wp:extent cx="504000" cy="216000"/>
                   <wp:docPr id="10" name="Picture 10"/>
                   <wp:cNvGraphicFramePr>
                     <a:graphicFrameLocks noChangeAspect="1"/>
@@ -2606,7 +2606,7 @@
                         <pic:spPr>
                           <a:xfrm>
                             <a:off x="0" y="0"/>
-                            <a:ext cx="504000" cy="340541"/>
+                            <a:ext cx="504000" cy="216000"/>
                           </a:xfrm>
                           <a:prstGeom prst="rect"/>
                         </pic:spPr>
@@ -2626,7 +2626,7 @@
                 <w:b/>
                 <w:sz w:val="26"/>
               </w:rPr>
-              <w:t>GREATER PRAISE SCHOOL SYSTEM</w:t>
+              <w:t>Suahco4</w:t>
             </w:r>
           </w:p>
           <w:p>
@@ -2650,7 +2650,7 @@
                 <w:b w:val="0"/>
                 <w:sz w:val="11"/>
               </w:rPr>
-              <w:t>Phone: 0775508030/0771241726 | Email:</w:t>
+              <w:t>Phone: 0778662590 | Email:</w:t>
             </w:r>
           </w:p>
           <w:p>
@@ -2672,7 +2672,7 @@
                 <w:color w:val="B8121B"/>
                 <w:sz w:val="16"/>
               </w:rPr>
-              <w:t>Receipt No: GPSS-064</w:t>
+              <w:t>Receipt No: SUAHCO4-064</w:t>
             </w:r>
             <w:r>
               <w:rPr>
@@ -2870,7 +2870,7 @@
             <w:r>
               <w:drawing>
                 <wp:inline xmlns:a="http://schemas.openxmlformats.org/drawingml/2006/main" xmlns:pic="http://schemas.openxmlformats.org/drawingml/2006/picture">
-                  <wp:extent cx="504000" cy="340541"/>
+                  <wp:extent cx="504000" cy="216000"/>
                   <wp:docPr id="11" name="Picture 11"/>
                   <wp:cNvGraphicFramePr>
                     <a:graphicFrameLocks noChangeAspect="1"/>
@@ -2891,7 +2891,7 @@
                         <pic:spPr>
                           <a:xfrm>
                             <a:off x="0" y="0"/>
-                            <a:ext cx="504000" cy="340541"/>
+                            <a:ext cx="504000" cy="216000"/>
                           </a:xfrm>
                           <a:prstGeom prst="rect"/>
                         </pic:spPr>
@@ -2911,7 +2911,7 @@
                 <w:b/>
                 <w:sz w:val="26"/>
               </w:rPr>
-              <w:t>GREATER PRAISE SCHOOL SYSTEM</w:t>
+              <w:t>Suahco4</w:t>
             </w:r>
           </w:p>
           <w:p>
@@ -2935,7 +2935,7 @@
                 <w:b w:val="0"/>
                 <w:sz w:val="11"/>
               </w:rPr>
-              <w:t>Phone: 0775508030/0771241726 | Email:</w:t>
+              <w:t>Phone: 0778662590 | Email:</w:t>
             </w:r>
           </w:p>
           <w:p>
@@ -2957,7 +2957,7 @@
                 <w:color w:val="B8121B"/>
                 <w:sz w:val="16"/>
               </w:rPr>
-              <w:t>Receipt No: GPSS-065</w:t>
+              <w:t>Receipt No: SUAHCO4-065</w:t>
             </w:r>
             <w:r>
               <w:rPr>
@@ -3155,7 +3155,7 @@
             <w:r>
               <w:drawing>
                 <wp:inline xmlns:a="http://schemas.openxmlformats.org/drawingml/2006/main" xmlns:pic="http://schemas.openxmlformats.org/drawingml/2006/picture">
-                  <wp:extent cx="504000" cy="340541"/>
+                  <wp:extent cx="504000" cy="216000"/>
                   <wp:docPr id="12" name="Picture 12"/>
                   <wp:cNvGraphicFramePr>
                     <a:graphicFrameLocks noChangeAspect="1"/>
@@ -3176,7 +3176,7 @@
                         <pic:spPr>
                           <a:xfrm>
                             <a:off x="0" y="0"/>
-                            <a:ext cx="504000" cy="340541"/>
+                            <a:ext cx="504000" cy="216000"/>
                           </a:xfrm>
                           <a:prstGeom prst="rect"/>
                         </pic:spPr>
@@ -3196,7 +3196,7 @@
                 <w:b/>
                 <w:sz w:val="26"/>
               </w:rPr>
-              <w:t>GREATER PRAISE SCHOOL SYSTEM</w:t>
+              <w:t>Suahco4</w:t>
             </w:r>
           </w:p>
           <w:p>
@@ -3220,7 +3220,7 @@
                 <w:b w:val="0"/>
                 <w:sz w:val="11"/>
               </w:rPr>
-              <w:t>Phone: 0775508030/0771241726 | Email:</w:t>
+              <w:t>Phone: 0778662590 | Email:</w:t>
             </w:r>
           </w:p>
           <w:p>
@@ -3242,7 +3242,7 @@
                 <w:color w:val="B8121B"/>
                 <w:sz w:val="16"/>
               </w:rPr>
-              <w:t>Receipt No: GPSS-066</w:t>
+              <w:t>Receipt No: SUAHCO4-066</w:t>
             </w:r>
             <w:r>
               <w:rPr>
@@ -3436,7 +3436,7 @@
             <w:r>
               <w:drawing>
                 <wp:inline xmlns:a="http://schemas.openxmlformats.org/drawingml/2006/main" xmlns:pic="http://schemas.openxmlformats.org/drawingml/2006/picture">
-                  <wp:extent cx="504000" cy="340541"/>
+                  <wp:extent cx="504000" cy="216000"/>
                   <wp:docPr id="13" name="Picture 13"/>
                   <wp:cNvGraphicFramePr>
                     <a:graphicFrameLocks noChangeAspect="1"/>
@@ -3457,7 +3457,7 @@
                         <pic:spPr>
                           <a:xfrm>
                             <a:off x="0" y="0"/>
-                            <a:ext cx="504000" cy="340541"/>
+                            <a:ext cx="504000" cy="216000"/>
                           </a:xfrm>
                           <a:prstGeom prst="rect"/>
                         </pic:spPr>
@@ -3477,7 +3477,7 @@
                 <w:b/>
                 <w:sz w:val="26"/>
               </w:rPr>
-              <w:t>GREATER PRAISE SCHOOL SYSTEM</w:t>
+              <w:t>Suahco4</w:t>
             </w:r>
           </w:p>
           <w:p>
@@ -3501,7 +3501,7 @@
                 <w:b w:val="0"/>
                 <w:sz w:val="11"/>
               </w:rPr>
-              <w:t>Phone: 0775508030/0771241726 | Email:</w:t>
+              <w:t>Phone: 0778662590 | Email:</w:t>
             </w:r>
           </w:p>
           <w:p>
@@ -3523,7 +3523,7 @@
                 <w:color w:val="B8121B"/>
                 <w:sz w:val="16"/>
               </w:rPr>
-              <w:t>Receipt No: GPSS-067</w:t>
+              <w:t>Receipt No: SUAHCO4-067</w:t>
             </w:r>
             <w:r>
               <w:rPr>
@@ -3721,7 +3721,7 @@
             <w:r>
               <w:drawing>
                 <wp:inline xmlns:a="http://schemas.openxmlformats.org/drawingml/2006/main" xmlns:pic="http://schemas.openxmlformats.org/drawingml/2006/picture">
-                  <wp:extent cx="504000" cy="340541"/>
+                  <wp:extent cx="504000" cy="216000"/>
                   <wp:docPr id="14" name="Picture 14"/>
                   <wp:cNvGraphicFramePr>
                     <a:graphicFrameLocks noChangeAspect="1"/>
@@ -3742,7 +3742,7 @@
                         <pic:spPr>
                           <a:xfrm>
                             <a:off x="0" y="0"/>
-                            <a:ext cx="504000" cy="340541"/>
+                            <a:ext cx="504000" cy="216000"/>
                           </a:xfrm>
                           <a:prstGeom prst="rect"/>
                         </pic:spPr>
@@ -3762,7 +3762,7 @@
                 <w:b/>
                 <w:sz w:val="26"/>
               </w:rPr>
-              <w:t>GREATER PRAISE SCHOOL SYSTEM</w:t>
+              <w:t>Suahco4</w:t>
             </w:r>
           </w:p>
           <w:p>
@@ -3786,7 +3786,7 @@
                 <w:b w:val="0"/>
                 <w:sz w:val="11"/>
               </w:rPr>
-              <w:t>Phone: 0775508030/0771241726 | Email:</w:t>
+              <w:t>Phone: 0778662590 | Email:</w:t>
             </w:r>
           </w:p>
           <w:p>
@@ -3808,7 +3808,7 @@
                 <w:color w:val="B8121B"/>
                 <w:sz w:val="16"/>
               </w:rPr>
-              <w:t>Receipt No: GPSS-068</w:t>
+              <w:t>Receipt No: SUAHCO4-068</w:t>
             </w:r>
             <w:r>
               <w:rPr>
@@ -4006,7 +4006,7 @@
             <w:r>
               <w:drawing>
                 <wp:inline xmlns:a="http://schemas.openxmlformats.org/drawingml/2006/main" xmlns:pic="http://schemas.openxmlformats.org/drawingml/2006/picture">
-                  <wp:extent cx="504000" cy="340541"/>
+                  <wp:extent cx="504000" cy="216000"/>
                   <wp:docPr id="15" name="Picture 15"/>
                   <wp:cNvGraphicFramePr>
                     <a:graphicFrameLocks noChangeAspect="1"/>
@@ -4027,7 +4027,7 @@
                         <pic:spPr>
                           <a:xfrm>
                             <a:off x="0" y="0"/>
-                            <a:ext cx="504000" cy="340541"/>
+                            <a:ext cx="504000" cy="216000"/>
                           </a:xfrm>
                           <a:prstGeom prst="rect"/>
                         </pic:spPr>
@@ -4047,7 +4047,7 @@
                 <w:b/>
                 <w:sz w:val="26"/>
               </w:rPr>
-              <w:t>GREATER PRAISE SCHOOL SYSTEM</w:t>
+              <w:t>Suahco4</w:t>
             </w:r>
           </w:p>
           <w:p>
@@ -4071,7 +4071,7 @@
                 <w:b w:val="0"/>
                 <w:sz w:val="11"/>
               </w:rPr>
-              <w:t>Phone: 0775508030/0771241726 | Email:</w:t>
+              <w:t>Phone: 0778662590 | Email:</w:t>
             </w:r>
           </w:p>
           <w:p>
@@ -4093,7 +4093,7 @@
                 <w:color w:val="B8121B"/>
                 <w:sz w:val="16"/>
               </w:rPr>
-              <w:t>Receipt No: GPSS-069</w:t>
+              <w:t>Receipt No: SUAHCO4-069</w:t>
             </w:r>
             <w:r>
               <w:rPr>
@@ -4287,7 +4287,7 @@
             <w:r>
               <w:drawing>
                 <wp:inline xmlns:a="http://schemas.openxmlformats.org/drawingml/2006/main" xmlns:pic="http://schemas.openxmlformats.org/drawingml/2006/picture">
-                  <wp:extent cx="504000" cy="340541"/>
+                  <wp:extent cx="504000" cy="216000"/>
                   <wp:docPr id="16" name="Picture 16"/>
                   <wp:cNvGraphicFramePr>
                     <a:graphicFrameLocks noChangeAspect="1"/>
@@ -4308,7 +4308,7 @@
                         <pic:spPr>
                           <a:xfrm>
                             <a:off x="0" y="0"/>
-                            <a:ext cx="504000" cy="340541"/>
+                            <a:ext cx="504000" cy="216000"/>
                           </a:xfrm>
                           <a:prstGeom prst="rect"/>
                         </pic:spPr>
@@ -4328,7 +4328,7 @@
                 <w:b/>
                 <w:sz w:val="26"/>
               </w:rPr>
-              <w:t>GREATER PRAISE SCHOOL SYSTEM</w:t>
+              <w:t>Suahco4</w:t>
             </w:r>
           </w:p>
           <w:p>
@@ -4352,7 +4352,7 @@
                 <w:b w:val="0"/>
                 <w:sz w:val="11"/>
               </w:rPr>
-              <w:t>Phone: 0775508030/0771241726 | Email:</w:t>
+              <w:t>Phone: 0778662590 | Email:</w:t>
             </w:r>
           </w:p>
           <w:p>
@@ -4374,7 +4374,7 @@
                 <w:color w:val="B8121B"/>
                 <w:sz w:val="16"/>
               </w:rPr>
-              <w:t>Receipt No: GPSS-067</w:t>
+              <w:t>Receipt No: SUAHCO4-067</w:t>
             </w:r>
             <w:r>
               <w:rPr>
@@ -4572,7 +4572,7 @@
             <w:r>
               <w:drawing>
                 <wp:inline xmlns:a="http://schemas.openxmlformats.org/drawingml/2006/main" xmlns:pic="http://schemas.openxmlformats.org/drawingml/2006/picture">
-                  <wp:extent cx="504000" cy="340541"/>
+                  <wp:extent cx="504000" cy="216000"/>
                   <wp:docPr id="17" name="Picture 17"/>
                   <wp:cNvGraphicFramePr>
                     <a:graphicFrameLocks noChangeAspect="1"/>
@@ -4593,7 +4593,7 @@
                         <pic:spPr>
                           <a:xfrm>
                             <a:off x="0" y="0"/>
-                            <a:ext cx="504000" cy="340541"/>
+                            <a:ext cx="504000" cy="216000"/>
                           </a:xfrm>
                           <a:prstGeom prst="rect"/>
                         </pic:spPr>
@@ -4613,7 +4613,7 @@
                 <w:b/>
                 <w:sz w:val="26"/>
               </w:rPr>
-              <w:t>GREATER PRAISE SCHOOL SYSTEM</w:t>
+              <w:t>Suahco4</w:t>
             </w:r>
           </w:p>
           <w:p>
@@ -4637,7 +4637,7 @@
                 <w:b w:val="0"/>
                 <w:sz w:val="11"/>
               </w:rPr>
-              <w:t>Phone: 0775508030/0771241726 | Email:</w:t>
+              <w:t>Phone: 0778662590 | Email:</w:t>
             </w:r>
           </w:p>
           <w:p>
@@ -4659,7 +4659,7 @@
                 <w:color w:val="B8121B"/>
                 <w:sz w:val="16"/>
               </w:rPr>
-              <w:t>Receipt No: GPSS-068</w:t>
+              <w:t>Receipt No: SUAHCO4-068</w:t>
             </w:r>
             <w:r>
               <w:rPr>
@@ -4857,7 +4857,7 @@
             <w:r>
               <w:drawing>
                 <wp:inline xmlns:a="http://schemas.openxmlformats.org/drawingml/2006/main" xmlns:pic="http://schemas.openxmlformats.org/drawingml/2006/picture">
-                  <wp:extent cx="504000" cy="340541"/>
+                  <wp:extent cx="504000" cy="216000"/>
                   <wp:docPr id="18" name="Picture 18"/>
                   <wp:cNvGraphicFramePr>
                     <a:graphicFrameLocks noChangeAspect="1"/>
@@ -4878,7 +4878,7 @@
                         <pic:spPr>
                           <a:xfrm>
                             <a:off x="0" y="0"/>
-                            <a:ext cx="504000" cy="340541"/>
+                            <a:ext cx="504000" cy="216000"/>
                           </a:xfrm>
                           <a:prstGeom prst="rect"/>
                         </pic:spPr>
@@ -4898,7 +4898,7 @@
                 <w:b/>
                 <w:sz w:val="26"/>
               </w:rPr>
-              <w:t>GREATER PRAISE SCHOOL SYSTEM</w:t>
+              <w:t>Suahco4</w:t>
             </w:r>
           </w:p>
           <w:p>
@@ -4922,7 +4922,7 @@
                 <w:b w:val="0"/>
                 <w:sz w:val="11"/>
               </w:rPr>
-              <w:t>Phone: 0775508030/0771241726 | Email:</w:t>
+              <w:t>Phone: 0778662590 | Email:</w:t>
             </w:r>
           </w:p>
           <w:p>
@@ -4944,7 +4944,7 @@
                 <w:color w:val="B8121B"/>
                 <w:sz w:val="16"/>
               </w:rPr>
-              <w:t>Receipt No: GPSS-069</w:t>
+              <w:t>Receipt No: SUAHCO4-069</w:t>
             </w:r>
             <w:r>
               <w:rPr>
@@ -5138,7 +5138,7 @@
             <w:r>
               <w:drawing>
                 <wp:inline xmlns:a="http://schemas.openxmlformats.org/drawingml/2006/main" xmlns:pic="http://schemas.openxmlformats.org/drawingml/2006/picture">
-                  <wp:extent cx="504000" cy="340541"/>
+                  <wp:extent cx="504000" cy="216000"/>
                   <wp:docPr id="19" name="Picture 19"/>
                   <wp:cNvGraphicFramePr>
                     <a:graphicFrameLocks noChangeAspect="1"/>
@@ -5159,7 +5159,7 @@
                         <pic:spPr>
                           <a:xfrm>
                             <a:off x="0" y="0"/>
-                            <a:ext cx="504000" cy="340541"/>
+                            <a:ext cx="504000" cy="216000"/>
                           </a:xfrm>
                           <a:prstGeom prst="rect"/>
                         </pic:spPr>
@@ -5179,7 +5179,7 @@
                 <w:b/>
                 <w:sz w:val="26"/>
               </w:rPr>
-              <w:t>GREATER PRAISE SCHOOL SYSTEM</w:t>
+              <w:t>Suahco4</w:t>
             </w:r>
           </w:p>
           <w:p>
@@ -5203,7 +5203,7 @@
                 <w:b w:val="0"/>
                 <w:sz w:val="11"/>
               </w:rPr>
-              <w:t>Phone: 0775508030/0771241726 | Email:</w:t>
+              <w:t>Phone: 0778662590 | Email:</w:t>
             </w:r>
           </w:p>
           <w:p>
@@ -5225,7 +5225,7 @@
                 <w:color w:val="B8121B"/>
                 <w:sz w:val="16"/>
               </w:rPr>
-              <w:t>Receipt No: GPSS-070</w:t>
+              <w:t>Receipt No: SUAHCO4-070</w:t>
             </w:r>
             <w:r>
               <w:rPr>
@@ -5423,7 +5423,7 @@
             <w:r>
               <w:drawing>
                 <wp:inline xmlns:a="http://schemas.openxmlformats.org/drawingml/2006/main" xmlns:pic="http://schemas.openxmlformats.org/drawingml/2006/picture">
-                  <wp:extent cx="504000" cy="340541"/>
+                  <wp:extent cx="504000" cy="216000"/>
                   <wp:docPr id="20" name="Picture 20"/>
                   <wp:cNvGraphicFramePr>
                     <a:graphicFrameLocks noChangeAspect="1"/>
@@ -5444,7 +5444,7 @@
                         <pic:spPr>
                           <a:xfrm>
                             <a:off x="0" y="0"/>
-                            <a:ext cx="504000" cy="340541"/>
+                            <a:ext cx="504000" cy="216000"/>
                           </a:xfrm>
                           <a:prstGeom prst="rect"/>
                         </pic:spPr>
@@ -5464,7 +5464,7 @@
                 <w:b/>
                 <w:sz w:val="26"/>
               </w:rPr>
-              <w:t>GREATER PRAISE SCHOOL SYSTEM</w:t>
+              <w:t>Suahco4</w:t>
             </w:r>
           </w:p>
           <w:p>
@@ -5488,7 +5488,7 @@
                 <w:b w:val="0"/>
                 <w:sz w:val="11"/>
               </w:rPr>
-              <w:t>Phone: 0775508030/0771241726 | Email:</w:t>
+              <w:t>Phone: 0778662590 | Email:</w:t>
             </w:r>
           </w:p>
           <w:p>
@@ -5510,7 +5510,7 @@
                 <w:color w:val="B8121B"/>
                 <w:sz w:val="16"/>
               </w:rPr>
-              <w:t>Receipt No: GPSS-071</w:t>
+              <w:t>Receipt No: SUAHCO4-071</w:t>
             </w:r>
             <w:r>
               <w:rPr>
@@ -5708,7 +5708,7 @@
             <w:r>
               <w:drawing>
                 <wp:inline xmlns:a="http://schemas.openxmlformats.org/drawingml/2006/main" xmlns:pic="http://schemas.openxmlformats.org/drawingml/2006/picture">
-                  <wp:extent cx="504000" cy="340541"/>
+                  <wp:extent cx="504000" cy="216000"/>
                   <wp:docPr id="21" name="Picture 21"/>
                   <wp:cNvGraphicFramePr>
                     <a:graphicFrameLocks noChangeAspect="1"/>
@@ -5729,7 +5729,7 @@
                         <pic:spPr>
                           <a:xfrm>
                             <a:off x="0" y="0"/>
-                            <a:ext cx="504000" cy="340541"/>
+                            <a:ext cx="504000" cy="216000"/>
                           </a:xfrm>
                           <a:prstGeom prst="rect"/>
                         </pic:spPr>
@@ -5749,7 +5749,7 @@
                 <w:b/>
                 <w:sz w:val="26"/>
               </w:rPr>
-              <w:t>GREATER PRAISE SCHOOL SYSTEM</w:t>
+              <w:t>Suahco4</w:t>
             </w:r>
           </w:p>
           <w:p>
@@ -5773,7 +5773,7 @@
                 <w:b w:val="0"/>
                 <w:sz w:val="11"/>
               </w:rPr>
-              <w:t>Phone: 0775508030/0771241726 | Email:</w:t>
+              <w:t>Phone: 0778662590 | Email:</w:t>
             </w:r>
           </w:p>
           <w:p>
@@ -5795,7 +5795,7 @@
                 <w:color w:val="B8121B"/>
                 <w:sz w:val="16"/>
               </w:rPr>
-              <w:t>Receipt No: GPSS-072</w:t>
+              <w:t>Receipt No: SUAHCO4-072</w:t>
             </w:r>
             <w:r>
               <w:rPr>
@@ -5989,7 +5989,7 @@
             <w:r>
               <w:drawing>
                 <wp:inline xmlns:a="http://schemas.openxmlformats.org/drawingml/2006/main" xmlns:pic="http://schemas.openxmlformats.org/drawingml/2006/picture">
-                  <wp:extent cx="504000" cy="340541"/>
+                  <wp:extent cx="504000" cy="216000"/>
                   <wp:docPr id="22" name="Picture 22"/>
                   <wp:cNvGraphicFramePr>
                     <a:graphicFrameLocks noChangeAspect="1"/>
@@ -6010,7 +6010,7 @@
                         <pic:spPr>
                           <a:xfrm>
                             <a:off x="0" y="0"/>
-                            <a:ext cx="504000" cy="340541"/>
+                            <a:ext cx="504000" cy="216000"/>
                           </a:xfrm>
                           <a:prstGeom prst="rect"/>
                         </pic:spPr>
@@ -6030,7 +6030,7 @@
                 <w:b/>
                 <w:sz w:val="26"/>
               </w:rPr>
-              <w:t>GREATER PRAISE SCHOOL SYSTEM</w:t>
+              <w:t>Suahco4</w:t>
             </w:r>
           </w:p>
           <w:p>
@@ -6054,7 +6054,7 @@
                 <w:b w:val="0"/>
                 <w:sz w:val="11"/>
               </w:rPr>
-              <w:t>Phone: 0775508030/0771241726 | Email:</w:t>
+              <w:t>Phone: 0778662590 | Email:</w:t>
             </w:r>
           </w:p>
           <w:p>
@@ -6076,7 +6076,7 @@
                 <w:color w:val="B8121B"/>
                 <w:sz w:val="16"/>
               </w:rPr>
-              <w:t>Receipt No: GPSS-070</w:t>
+              <w:t>Receipt No: SUAHCO4-070</w:t>
             </w:r>
             <w:r>
               <w:rPr>
@@ -6274,7 +6274,7 @@
             <w:r>
               <w:drawing>
                 <wp:inline xmlns:a="http://schemas.openxmlformats.org/drawingml/2006/main" xmlns:pic="http://schemas.openxmlformats.org/drawingml/2006/picture">
-                  <wp:extent cx="504000" cy="340541"/>
+                  <wp:extent cx="504000" cy="216000"/>
                   <wp:docPr id="23" name="Picture 23"/>
                   <wp:cNvGraphicFramePr>
                     <a:graphicFrameLocks noChangeAspect="1"/>
@@ -6295,7 +6295,7 @@
                         <pic:spPr>
                           <a:xfrm>
                             <a:off x="0" y="0"/>
-                            <a:ext cx="504000" cy="340541"/>
+                            <a:ext cx="504000" cy="216000"/>
                           </a:xfrm>
                           <a:prstGeom prst="rect"/>
                         </pic:spPr>
@@ -6315,7 +6315,7 @@
                 <w:b/>
                 <w:sz w:val="26"/>
               </w:rPr>
-              <w:t>GREATER PRAISE SCHOOL SYSTEM</w:t>
+              <w:t>Suahco4</w:t>
             </w:r>
           </w:p>
           <w:p>
@@ -6339,7 +6339,7 @@
                 <w:b w:val="0"/>
                 <w:sz w:val="11"/>
               </w:rPr>
-              <w:t>Phone: 0775508030/0771241726 | Email:</w:t>
+              <w:t>Phone: 0778662590 | Email:</w:t>
             </w:r>
           </w:p>
           <w:p>
@@ -6361,7 +6361,7 @@
                 <w:color w:val="B8121B"/>
                 <w:sz w:val="16"/>
               </w:rPr>
-              <w:t>Receipt No: GPSS-071</w:t>
+              <w:t>Receipt No: SUAHCO4-071</w:t>
             </w:r>
             <w:r>
               <w:rPr>
@@ -6559,7 +6559,7 @@
             <w:r>
               <w:drawing>
                 <wp:inline xmlns:a="http://schemas.openxmlformats.org/drawingml/2006/main" xmlns:pic="http://schemas.openxmlformats.org/drawingml/2006/picture">
-                  <wp:extent cx="504000" cy="340541"/>
+                  <wp:extent cx="504000" cy="216000"/>
                   <wp:docPr id="24" name="Picture 24"/>
                   <wp:cNvGraphicFramePr>
                     <a:graphicFrameLocks noChangeAspect="1"/>
@@ -6580,7 +6580,7 @@
                         <pic:spPr>
                           <a:xfrm>
                             <a:off x="0" y="0"/>
-                            <a:ext cx="504000" cy="340541"/>
+                            <a:ext cx="504000" cy="216000"/>
                           </a:xfrm>
                           <a:prstGeom prst="rect"/>
                         </pic:spPr>
@@ -6600,7 +6600,7 @@
                 <w:b/>
                 <w:sz w:val="26"/>
               </w:rPr>
-              <w:t>GREATER PRAISE SCHOOL SYSTEM</w:t>
+              <w:t>Suahco4</w:t>
             </w:r>
           </w:p>
           <w:p>
@@ -6624,7 +6624,7 @@
                 <w:b w:val="0"/>
                 <w:sz w:val="11"/>
               </w:rPr>
-              <w:t>Phone: 0775508030/0771241726 | Email:</w:t>
+              <w:t>Phone: 0778662590 | Email:</w:t>
             </w:r>
           </w:p>
           <w:p>
@@ -6646,7 +6646,7 @@
                 <w:color w:val="B8121B"/>
                 <w:sz w:val="16"/>
               </w:rPr>
-              <w:t>Receipt No: GPSS-072</w:t>
+              <w:t>Receipt No: SUAHCO4-072</w:t>
             </w:r>
             <w:r>
               <w:rPr>
@@ -6840,7 +6840,7 @@
             <w:r>
               <w:drawing>
                 <wp:inline xmlns:a="http://schemas.openxmlformats.org/drawingml/2006/main" xmlns:pic="http://schemas.openxmlformats.org/drawingml/2006/picture">
-                  <wp:extent cx="504000" cy="340541"/>
+                  <wp:extent cx="504000" cy="216000"/>
                   <wp:docPr id="25" name="Picture 25"/>
                   <wp:cNvGraphicFramePr>
                     <a:graphicFrameLocks noChangeAspect="1"/>
@@ -6861,7 +6861,7 @@
                         <pic:spPr>
                           <a:xfrm>
                             <a:off x="0" y="0"/>
-                            <a:ext cx="504000" cy="340541"/>
+                            <a:ext cx="504000" cy="216000"/>
                           </a:xfrm>
                           <a:prstGeom prst="rect"/>
                         </pic:spPr>
@@ -6881,7 +6881,7 @@
                 <w:b/>
                 <w:sz w:val="26"/>
               </w:rPr>
-              <w:t>GREATER PRAISE SCHOOL SYSTEM</w:t>
+              <w:t>Suahco4</w:t>
             </w:r>
           </w:p>
           <w:p>
@@ -6905,7 +6905,7 @@
                 <w:b w:val="0"/>
                 <w:sz w:val="11"/>
               </w:rPr>
-              <w:t>Phone: 0775508030/0771241726 | Email:</w:t>
+              <w:t>Phone: 0778662590 | Email:</w:t>
             </w:r>
           </w:p>
           <w:p>
@@ -6927,7 +6927,7 @@
                 <w:color w:val="B8121B"/>
                 <w:sz w:val="16"/>
               </w:rPr>
-              <w:t>Receipt No: GPSS-073</w:t>
+              <w:t>Receipt No: SUAHCO4-073</w:t>
             </w:r>
             <w:r>
               <w:rPr>
@@ -7125,7 +7125,7 @@
             <w:r>
               <w:drawing>
                 <wp:inline xmlns:a="http://schemas.openxmlformats.org/drawingml/2006/main" xmlns:pic="http://schemas.openxmlformats.org/drawingml/2006/picture">
-                  <wp:extent cx="504000" cy="340541"/>
+                  <wp:extent cx="504000" cy="216000"/>
                   <wp:docPr id="26" name="Picture 26"/>
                   <wp:cNvGraphicFramePr>
                     <a:graphicFrameLocks noChangeAspect="1"/>
@@ -7146,7 +7146,7 @@
                         <pic:spPr>
                           <a:xfrm>
                             <a:off x="0" y="0"/>
-                            <a:ext cx="504000" cy="340541"/>
+                            <a:ext cx="504000" cy="216000"/>
                           </a:xfrm>
                           <a:prstGeom prst="rect"/>
                         </pic:spPr>
@@ -7166,7 +7166,7 @@
                 <w:b/>
                 <w:sz w:val="26"/>
               </w:rPr>
-              <w:t>GREATER PRAISE SCHOOL SYSTEM</w:t>
+              <w:t>Suahco4</w:t>
             </w:r>
           </w:p>
           <w:p>
@@ -7190,7 +7190,7 @@
                 <w:b w:val="0"/>
                 <w:sz w:val="11"/>
               </w:rPr>
-              <w:t>Phone: 0775508030/0771241726 | Email:</w:t>
+              <w:t>Phone: 0778662590 | Email:</w:t>
             </w:r>
           </w:p>
           <w:p>
@@ -7212,7 +7212,7 @@
                 <w:color w:val="B8121B"/>
                 <w:sz w:val="16"/>
               </w:rPr>
-              <w:t>Receipt No: GPSS-074</w:t>
+              <w:t>Receipt No: SUAHCO4-074</w:t>
             </w:r>
             <w:r>
               <w:rPr>
@@ -7410,7 +7410,7 @@
             <w:r>
               <w:drawing>
                 <wp:inline xmlns:a="http://schemas.openxmlformats.org/drawingml/2006/main" xmlns:pic="http://schemas.openxmlformats.org/drawingml/2006/picture">
-                  <wp:extent cx="504000" cy="340541"/>
+                  <wp:extent cx="504000" cy="216000"/>
                   <wp:docPr id="27" name="Picture 27"/>
                   <wp:cNvGraphicFramePr>
                     <a:graphicFrameLocks noChangeAspect="1"/>
@@ -7431,7 +7431,7 @@
                         <pic:spPr>
                           <a:xfrm>
                             <a:off x="0" y="0"/>
-                            <a:ext cx="504000" cy="340541"/>
+                            <a:ext cx="504000" cy="216000"/>
                           </a:xfrm>
                           <a:prstGeom prst="rect"/>
                         </pic:spPr>
@@ -7451,7 +7451,7 @@
                 <w:b/>
                 <w:sz w:val="26"/>
               </w:rPr>
-              <w:t>GREATER PRAISE SCHOOL SYSTEM</w:t>
+              <w:t>Suahco4</w:t>
             </w:r>
           </w:p>
           <w:p>
@@ -7475,7 +7475,7 @@
                 <w:b w:val="0"/>
                 <w:sz w:val="11"/>
               </w:rPr>
-              <w:t>Phone: 0775508030/0771241726 | Email:</w:t>
+              <w:t>Phone: 0778662590 | Email:</w:t>
             </w:r>
           </w:p>
           <w:p>
@@ -7497,7 +7497,7 @@
                 <w:color w:val="B8121B"/>
                 <w:sz w:val="16"/>
               </w:rPr>
-              <w:t>Receipt No: GPSS-075</w:t>
+              <w:t>Receipt No: SUAHCO4-075</w:t>
             </w:r>
             <w:r>
               <w:rPr>
@@ -7691,7 +7691,7 @@
             <w:r>
               <w:drawing>
                 <wp:inline xmlns:a="http://schemas.openxmlformats.org/drawingml/2006/main" xmlns:pic="http://schemas.openxmlformats.org/drawingml/2006/picture">
-                  <wp:extent cx="504000" cy="340541"/>
+                  <wp:extent cx="504000" cy="216000"/>
                   <wp:docPr id="28" name="Picture 28"/>
                   <wp:cNvGraphicFramePr>
                     <a:graphicFrameLocks noChangeAspect="1"/>
@@ -7712,7 +7712,7 @@
                         <pic:spPr>
                           <a:xfrm>
                             <a:off x="0" y="0"/>
-                            <a:ext cx="504000" cy="340541"/>
+                            <a:ext cx="504000" cy="216000"/>
                           </a:xfrm>
                           <a:prstGeom prst="rect"/>
                         </pic:spPr>
@@ -7732,7 +7732,7 @@
                 <w:b/>
                 <w:sz w:val="26"/>
               </w:rPr>
-              <w:t>GREATER PRAISE SCHOOL SYSTEM</w:t>
+              <w:t>Suahco4</w:t>
             </w:r>
           </w:p>
           <w:p>
@@ -7756,7 +7756,7 @@
                 <w:b w:val="0"/>
                 <w:sz w:val="11"/>
               </w:rPr>
-              <w:t>Phone: 0775508030/0771241726 | Email:</w:t>
+              <w:t>Phone: 0778662590 | Email:</w:t>
             </w:r>
           </w:p>
           <w:p>
@@ -7778,7 +7778,7 @@
                 <w:color w:val="B8121B"/>
                 <w:sz w:val="16"/>
               </w:rPr>
-              <w:t>Receipt No: GPSS-073</w:t>
+              <w:t>Receipt No: SUAHCO4-073</w:t>
             </w:r>
             <w:r>
               <w:rPr>
@@ -7976,7 +7976,7 @@
             <w:r>
               <w:drawing>
                 <wp:inline xmlns:a="http://schemas.openxmlformats.org/drawingml/2006/main" xmlns:pic="http://schemas.openxmlformats.org/drawingml/2006/picture">
-                  <wp:extent cx="504000" cy="340541"/>
+                  <wp:extent cx="504000" cy="216000"/>
                   <wp:docPr id="29" name="Picture 29"/>
                   <wp:cNvGraphicFramePr>
                     <a:graphicFrameLocks noChangeAspect="1"/>
@@ -7997,7 +7997,7 @@
                         <pic:spPr>
                           <a:xfrm>
                             <a:off x="0" y="0"/>
-                            <a:ext cx="504000" cy="340541"/>
+                            <a:ext cx="504000" cy="216000"/>
                           </a:xfrm>
                           <a:prstGeom prst="rect"/>
                         </pic:spPr>
@@ -8017,7 +8017,7 @@
                 <w:b/>
                 <w:sz w:val="26"/>
               </w:rPr>
-              <w:t>GREATER PRAISE SCHOOL SYSTEM</w:t>
+              <w:t>Suahco4</w:t>
             </w:r>
           </w:p>
           <w:p>
@@ -8041,7 +8041,7 @@
                 <w:b w:val="0"/>
                 <w:sz w:val="11"/>
               </w:rPr>
-              <w:t>Phone: 0775508030/0771241726 | Email:</w:t>
+              <w:t>Phone: 0778662590 | Email:</w:t>
             </w:r>
           </w:p>
           <w:p>
@@ -8063,7 +8063,7 @@
                 <w:color w:val="B8121B"/>
                 <w:sz w:val="16"/>
               </w:rPr>
-              <w:t>Receipt No: GPSS-074</w:t>
+              <w:t>Receipt No: SUAHCO4-074</w:t>
             </w:r>
             <w:r>
               <w:rPr>
@@ -8261,7 +8261,7 @@
             <w:r>
               <w:drawing>
                 <wp:inline xmlns:a="http://schemas.openxmlformats.org/drawingml/2006/main" xmlns:pic="http://schemas.openxmlformats.org/drawingml/2006/picture">
-                  <wp:extent cx="504000" cy="340541"/>
+                  <wp:extent cx="504000" cy="216000"/>
                   <wp:docPr id="30" name="Picture 30"/>
                   <wp:cNvGraphicFramePr>
                     <a:graphicFrameLocks noChangeAspect="1"/>
@@ -8282,7 +8282,7 @@
                         <pic:spPr>
                           <a:xfrm>
                             <a:off x="0" y="0"/>
-                            <a:ext cx="504000" cy="340541"/>
+                            <a:ext cx="504000" cy="216000"/>
                           </a:xfrm>
                           <a:prstGeom prst="rect"/>
                         </pic:spPr>
@@ -8302,7 +8302,7 @@
                 <w:b/>
                 <w:sz w:val="26"/>
               </w:rPr>
-              <w:t>GREATER PRAISE SCHOOL SYSTEM</w:t>
+              <w:t>Suahco4</w:t>
             </w:r>
           </w:p>
           <w:p>
@@ -8326,7 +8326,7 @@
                 <w:b w:val="0"/>
                 <w:sz w:val="11"/>
               </w:rPr>
-              <w:t>Phone: 0775508030/0771241726 | Email:</w:t>
+              <w:t>Phone: 0778662590 | Email:</w:t>
             </w:r>
           </w:p>
           <w:p>
@@ -8348,7 +8348,7 @@
                 <w:color w:val="B8121B"/>
                 <w:sz w:val="16"/>
               </w:rPr>
-              <w:t>Receipt No: GPSS-075</w:t>
+              <w:t>Receipt No: SUAHCO4-075</w:t>
             </w:r>
             <w:r>
               <w:rPr>
@@ -8542,7 +8542,7 @@
             <w:r>
               <w:drawing>
                 <wp:inline xmlns:a="http://schemas.openxmlformats.org/drawingml/2006/main" xmlns:pic="http://schemas.openxmlformats.org/drawingml/2006/picture">
-                  <wp:extent cx="504000" cy="340541"/>
+                  <wp:extent cx="504000" cy="216000"/>
                   <wp:docPr id="31" name="Picture 31"/>
                   <wp:cNvGraphicFramePr>
                     <a:graphicFrameLocks noChangeAspect="1"/>
@@ -8563,7 +8563,7 @@
                         <pic:spPr>
                           <a:xfrm>
                             <a:off x="0" y="0"/>
-                            <a:ext cx="504000" cy="340541"/>
+                            <a:ext cx="504000" cy="216000"/>
                           </a:xfrm>
                           <a:prstGeom prst="rect"/>
                         </pic:spPr>
@@ -8583,7 +8583,7 @@
                 <w:b/>
                 <w:sz w:val="26"/>
               </w:rPr>
-              <w:t>GREATER PRAISE SCHOOL SYSTEM</w:t>
+              <w:t>Suahco4</w:t>
             </w:r>
           </w:p>
           <w:p>
@@ -8607,7 +8607,7 @@
                 <w:b w:val="0"/>
                 <w:sz w:val="11"/>
               </w:rPr>
-              <w:t>Phone: 0775508030/0771241726 | Email:</w:t>
+              <w:t>Phone: 0778662590 | Email:</w:t>
             </w:r>
           </w:p>
           <w:p>
@@ -8629,7 +8629,7 @@
                 <w:color w:val="B8121B"/>
                 <w:sz w:val="16"/>
               </w:rPr>
-              <w:t>Receipt No: GPSS-076</w:t>
+              <w:t>Receipt No: SUAHCO4-076</w:t>
             </w:r>
             <w:r>
               <w:rPr>
@@ -8827,7 +8827,7 @@
             <w:r>
               <w:drawing>
                 <wp:inline xmlns:a="http://schemas.openxmlformats.org/drawingml/2006/main" xmlns:pic="http://schemas.openxmlformats.org/drawingml/2006/picture">
-                  <wp:extent cx="504000" cy="340541"/>
+                  <wp:extent cx="504000" cy="216000"/>
                   <wp:docPr id="32" name="Picture 32"/>
                   <wp:cNvGraphicFramePr>
                     <a:graphicFrameLocks noChangeAspect="1"/>
@@ -8848,7 +8848,7 @@
                         <pic:spPr>
                           <a:xfrm>
                             <a:off x="0" y="0"/>
-                            <a:ext cx="504000" cy="340541"/>
+                            <a:ext cx="504000" cy="216000"/>
                           </a:xfrm>
                           <a:prstGeom prst="rect"/>
                         </pic:spPr>
@@ -8868,7 +8868,7 @@
                 <w:b/>
                 <w:sz w:val="26"/>
               </w:rPr>
-              <w:t>GREATER PRAISE SCHOOL SYSTEM</w:t>
+              <w:t>Suahco4</w:t>
             </w:r>
           </w:p>
           <w:p>
@@ -8892,7 +8892,7 @@
                 <w:b w:val="0"/>
                 <w:sz w:val="11"/>
               </w:rPr>
-              <w:t>Phone: 0775508030/0771241726 | Email:</w:t>
+              <w:t>Phone: 0778662590 | Email:</w:t>
             </w:r>
           </w:p>
           <w:p>
@@ -8914,7 +8914,7 @@
                 <w:color w:val="B8121B"/>
                 <w:sz w:val="16"/>
               </w:rPr>
-              <w:t>Receipt No: GPSS-077</w:t>
+              <w:t>Receipt No: SUAHCO4-077</w:t>
             </w:r>
             <w:r>
               <w:rPr>
@@ -9112,7 +9112,7 @@
             <w:r>
               <w:drawing>
                 <wp:inline xmlns:a="http://schemas.openxmlformats.org/drawingml/2006/main" xmlns:pic="http://schemas.openxmlformats.org/drawingml/2006/picture">
-                  <wp:extent cx="504000" cy="340541"/>
+                  <wp:extent cx="504000" cy="216000"/>
                   <wp:docPr id="33" name="Picture 33"/>
                   <wp:cNvGraphicFramePr>
                     <a:graphicFrameLocks noChangeAspect="1"/>
@@ -9133,7 +9133,7 @@
                         <pic:spPr>
                           <a:xfrm>
                             <a:off x="0" y="0"/>
-                            <a:ext cx="504000" cy="340541"/>
+                            <a:ext cx="504000" cy="216000"/>
                           </a:xfrm>
                           <a:prstGeom prst="rect"/>
                         </pic:spPr>
@@ -9153,7 +9153,7 @@
                 <w:b/>
                 <w:sz w:val="26"/>
               </w:rPr>
-              <w:t>GREATER PRAISE SCHOOL SYSTEM</w:t>
+              <w:t>Suahco4</w:t>
             </w:r>
           </w:p>
           <w:p>
@@ -9177,7 +9177,7 @@
                 <w:b w:val="0"/>
                 <w:sz w:val="11"/>
               </w:rPr>
-              <w:t>Phone: 0775508030/0771241726 | Email:</w:t>
+              <w:t>Phone: 0778662590 | Email:</w:t>
             </w:r>
           </w:p>
           <w:p>
@@ -9199,7 +9199,7 @@
                 <w:color w:val="B8121B"/>
                 <w:sz w:val="16"/>
               </w:rPr>
-              <w:t>Receipt No: GPSS-078</w:t>
+              <w:t>Receipt No: SUAHCO4-078</w:t>
             </w:r>
             <w:r>
               <w:rPr>
@@ -9393,7 +9393,7 @@
             <w:r>
               <w:drawing>
                 <wp:inline xmlns:a="http://schemas.openxmlformats.org/drawingml/2006/main" xmlns:pic="http://schemas.openxmlformats.org/drawingml/2006/picture">
-                  <wp:extent cx="504000" cy="340541"/>
+                  <wp:extent cx="504000" cy="216000"/>
                   <wp:docPr id="34" name="Picture 34"/>
                   <wp:cNvGraphicFramePr>
                     <a:graphicFrameLocks noChangeAspect="1"/>
@@ -9414,7 +9414,7 @@
                         <pic:spPr>
                           <a:xfrm>
                             <a:off x="0" y="0"/>
-                            <a:ext cx="504000" cy="340541"/>
+                            <a:ext cx="504000" cy="216000"/>
                           </a:xfrm>
                           <a:prstGeom prst="rect"/>
                         </pic:spPr>
@@ -9434,7 +9434,7 @@
                 <w:b/>
                 <w:sz w:val="26"/>
               </w:rPr>
-              <w:t>GREATER PRAISE SCHOOL SYSTEM</w:t>
+              <w:t>Suahco4</w:t>
             </w:r>
           </w:p>
           <w:p>
@@ -9458,7 +9458,7 @@
                 <w:b w:val="0"/>
                 <w:sz w:val="11"/>
               </w:rPr>
-              <w:t>Phone: 0775508030/0771241726 | Email:</w:t>
+              <w:t>Phone: 0778662590 | Email:</w:t>
             </w:r>
           </w:p>
           <w:p>
@@ -9480,7 +9480,7 @@
                 <w:color w:val="B8121B"/>
                 <w:sz w:val="16"/>
               </w:rPr>
-              <w:t>Receipt No: GPSS-076</w:t>
+              <w:t>Receipt No: SUAHCO4-076</w:t>
             </w:r>
             <w:r>
               <w:rPr>
@@ -9678,7 +9678,7 @@
             <w:r>
               <w:drawing>
                 <wp:inline xmlns:a="http://schemas.openxmlformats.org/drawingml/2006/main" xmlns:pic="http://schemas.openxmlformats.org/drawingml/2006/picture">
-                  <wp:extent cx="504000" cy="340541"/>
+                  <wp:extent cx="504000" cy="216000"/>
                   <wp:docPr id="35" name="Picture 35"/>
                   <wp:cNvGraphicFramePr>
                     <a:graphicFrameLocks noChangeAspect="1"/>
@@ -9699,7 +9699,7 @@
                         <pic:spPr>
                           <a:xfrm>
                             <a:off x="0" y="0"/>
-                            <a:ext cx="504000" cy="340541"/>
+                            <a:ext cx="504000" cy="216000"/>
                           </a:xfrm>
                           <a:prstGeom prst="rect"/>
                         </pic:spPr>
@@ -9719,7 +9719,7 @@
                 <w:b/>
                 <w:sz w:val="26"/>
               </w:rPr>
-              <w:t>GREATER PRAISE SCHOOL SYSTEM</w:t>
+              <w:t>Suahco4</w:t>
             </w:r>
           </w:p>
           <w:p>
@@ -9743,7 +9743,7 @@
                 <w:b w:val="0"/>
                 <w:sz w:val="11"/>
               </w:rPr>
-              <w:t>Phone: 0775508030/0771241726 | Email:</w:t>
+              <w:t>Phone: 0778662590 | Email:</w:t>
             </w:r>
           </w:p>
           <w:p>
@@ -9765,7 +9765,7 @@
                 <w:color w:val="B8121B"/>
                 <w:sz w:val="16"/>
               </w:rPr>
-              <w:t>Receipt No: GPSS-077</w:t>
+              <w:t>Receipt No: SUAHCO4-077</w:t>
             </w:r>
             <w:r>
               <w:rPr>
@@ -9963,7 +9963,7 @@
             <w:r>
               <w:drawing>
                 <wp:inline xmlns:a="http://schemas.openxmlformats.org/drawingml/2006/main" xmlns:pic="http://schemas.openxmlformats.org/drawingml/2006/picture">
-                  <wp:extent cx="504000" cy="340541"/>
+                  <wp:extent cx="504000" cy="216000"/>
                   <wp:docPr id="36" name="Picture 36"/>
                   <wp:cNvGraphicFramePr>
                     <a:graphicFrameLocks noChangeAspect="1"/>
@@ -9984,7 +9984,7 @@
                         <pic:spPr>
                           <a:xfrm>
                             <a:off x="0" y="0"/>
-                            <a:ext cx="504000" cy="340541"/>
+                            <a:ext cx="504000" cy="216000"/>
                           </a:xfrm>
                           <a:prstGeom prst="rect"/>
                         </pic:spPr>
@@ -10004,7 +10004,7 @@
                 <w:b/>
                 <w:sz w:val="26"/>
               </w:rPr>
-              <w:t>GREATER PRAISE SCHOOL SYSTEM</w:t>
+              <w:t>Suahco4</w:t>
             </w:r>
           </w:p>
           <w:p>
@@ -10028,7 +10028,7 @@
                 <w:b w:val="0"/>
                 <w:sz w:val="11"/>
               </w:rPr>
-              <w:t>Phone: 0775508030/0771241726 | Email:</w:t>
+              <w:t>Phone: 0778662590 | Email:</w:t>
             </w:r>
           </w:p>
           <w:p>
@@ -10050,7 +10050,7 @@
                 <w:color w:val="B8121B"/>
                 <w:sz w:val="16"/>
               </w:rPr>
-              <w:t>Receipt No: GPSS-078</w:t>
+              <w:t>Receipt No: SUAHCO4-078</w:t>
             </w:r>
             <w:r>
               <w:rPr>
@@ -10244,7 +10244,7 @@
             <w:r>
               <w:drawing>
                 <wp:inline xmlns:a="http://schemas.openxmlformats.org/drawingml/2006/main" xmlns:pic="http://schemas.openxmlformats.org/drawingml/2006/picture">
-                  <wp:extent cx="504000" cy="340541"/>
+                  <wp:extent cx="504000" cy="216000"/>
                   <wp:docPr id="37" name="Picture 37"/>
                   <wp:cNvGraphicFramePr>
                     <a:graphicFrameLocks noChangeAspect="1"/>
@@ -10265,7 +10265,7 @@
                         <pic:spPr>
                           <a:xfrm>
                             <a:off x="0" y="0"/>
-                            <a:ext cx="504000" cy="340541"/>
+                            <a:ext cx="504000" cy="216000"/>
                           </a:xfrm>
                           <a:prstGeom prst="rect"/>
                         </pic:spPr>
@@ -10285,7 +10285,7 @@
                 <w:b/>
                 <w:sz w:val="26"/>
               </w:rPr>
-              <w:t>GREATER PRAISE SCHOOL SYSTEM</w:t>
+              <w:t>Suahco4</w:t>
             </w:r>
           </w:p>
           <w:p>
@@ -10309,7 +10309,7 @@
                 <w:b w:val="0"/>
                 <w:sz w:val="11"/>
               </w:rPr>
-              <w:t>Phone: 0775508030/0771241726 | Email:</w:t>
+              <w:t>Phone: 0778662590 | Email:</w:t>
             </w:r>
           </w:p>
           <w:p>
@@ -10331,7 +10331,7 @@
                 <w:color w:val="B8121B"/>
                 <w:sz w:val="16"/>
               </w:rPr>
-              <w:t>Receipt No: GPSS-079</w:t>
+              <w:t>Receipt No: SUAHCO4-079</w:t>
             </w:r>
             <w:r>
               <w:rPr>
@@ -10529,7 +10529,7 @@
             <w:r>
               <w:drawing>
                 <wp:inline xmlns:a="http://schemas.openxmlformats.org/drawingml/2006/main" xmlns:pic="http://schemas.openxmlformats.org/drawingml/2006/picture">
-                  <wp:extent cx="504000" cy="340541"/>
+                  <wp:extent cx="504000" cy="216000"/>
                   <wp:docPr id="38" name="Picture 38"/>
                   <wp:cNvGraphicFramePr>
                     <a:graphicFrameLocks noChangeAspect="1"/>
@@ -10550,7 +10550,7 @@
                         <pic:spPr>
                           <a:xfrm>
                             <a:off x="0" y="0"/>
-                            <a:ext cx="504000" cy="340541"/>
+                            <a:ext cx="504000" cy="216000"/>
                           </a:xfrm>
                           <a:prstGeom prst="rect"/>
                         </pic:spPr>
@@ -10570,7 +10570,7 @@
                 <w:b/>
                 <w:sz w:val="26"/>
               </w:rPr>
-              <w:t>GREATER PRAISE SCHOOL SYSTEM</w:t>
+              <w:t>Suahco4</w:t>
             </w:r>
           </w:p>
           <w:p>
@@ -10594,7 +10594,7 @@
                 <w:b w:val="0"/>
                 <w:sz w:val="11"/>
               </w:rPr>
-              <w:t>Phone: 0775508030/0771241726 | Email:</w:t>
+              <w:t>Phone: 0778662590 | Email:</w:t>
             </w:r>
           </w:p>
           <w:p>
@@ -10616,7 +10616,7 @@
                 <w:color w:val="B8121B"/>
                 <w:sz w:val="16"/>
               </w:rPr>
-              <w:t>Receipt No: GPSS-080</w:t>
+              <w:t>Receipt No: SUAHCO4-080</w:t>
             </w:r>
             <w:r>
               <w:rPr>
@@ -10814,7 +10814,7 @@
             <w:r>
               <w:drawing>
                 <wp:inline xmlns:a="http://schemas.openxmlformats.org/drawingml/2006/main" xmlns:pic="http://schemas.openxmlformats.org/drawingml/2006/picture">
-                  <wp:extent cx="504000" cy="340541"/>
+                  <wp:extent cx="504000" cy="216000"/>
                   <wp:docPr id="39" name="Picture 39"/>
                   <wp:cNvGraphicFramePr>
                     <a:graphicFrameLocks noChangeAspect="1"/>
@@ -10835,7 +10835,7 @@
                         <pic:spPr>
                           <a:xfrm>
                             <a:off x="0" y="0"/>
-                            <a:ext cx="504000" cy="340541"/>
+                            <a:ext cx="504000" cy="216000"/>
                           </a:xfrm>
                           <a:prstGeom prst="rect"/>
                         </pic:spPr>
@@ -10855,7 +10855,7 @@
                 <w:b/>
                 <w:sz w:val="26"/>
               </w:rPr>
-              <w:t>GREATER PRAISE SCHOOL SYSTEM</w:t>
+              <w:t>Suahco4</w:t>
             </w:r>
           </w:p>
           <w:p>
@@ -10879,7 +10879,7 @@
                 <w:b w:val="0"/>
                 <w:sz w:val="11"/>
               </w:rPr>
-              <w:t>Phone: 0775508030/0771241726 | Email:</w:t>
+              <w:t>Phone: 0778662590 | Email:</w:t>
             </w:r>
           </w:p>
           <w:p>
@@ -10901,7 +10901,7 @@
                 <w:color w:val="B8121B"/>
                 <w:sz w:val="16"/>
               </w:rPr>
-              <w:t>Receipt No: GPSS-081</w:t>
+              <w:t>Receipt No: SUAHCO4-081</w:t>
             </w:r>
             <w:r>
               <w:rPr>
@@ -11095,7 +11095,7 @@
             <w:r>
               <w:drawing>
                 <wp:inline xmlns:a="http://schemas.openxmlformats.org/drawingml/2006/main" xmlns:pic="http://schemas.openxmlformats.org/drawingml/2006/picture">
-                  <wp:extent cx="504000" cy="340541"/>
+                  <wp:extent cx="504000" cy="216000"/>
                   <wp:docPr id="40" name="Picture 40"/>
                   <wp:cNvGraphicFramePr>
                     <a:graphicFrameLocks noChangeAspect="1"/>
@@ -11116,7 +11116,7 @@
                         <pic:spPr>
                           <a:xfrm>
                             <a:off x="0" y="0"/>
-                            <a:ext cx="504000" cy="340541"/>
+                            <a:ext cx="504000" cy="216000"/>
                           </a:xfrm>
                           <a:prstGeom prst="rect"/>
                         </pic:spPr>
@@ -11136,7 +11136,7 @@
                 <w:b/>
                 <w:sz w:val="26"/>
               </w:rPr>
-              <w:t>GREATER PRAISE SCHOOL SYSTEM</w:t>
+              <w:t>Suahco4</w:t>
             </w:r>
           </w:p>
           <w:p>
@@ -11160,7 +11160,7 @@
                 <w:b w:val="0"/>
                 <w:sz w:val="11"/>
               </w:rPr>
-              <w:t>Phone: 0775508030/0771241726 | Email:</w:t>
+              <w:t>Phone: 0778662590 | Email:</w:t>
             </w:r>
           </w:p>
           <w:p>
@@ -11182,7 +11182,7 @@
                 <w:color w:val="B8121B"/>
                 <w:sz w:val="16"/>
               </w:rPr>
-              <w:t>Receipt No: GPSS-079</w:t>
+              <w:t>Receipt No: SUAHCO4-079</w:t>
             </w:r>
             <w:r>
               <w:rPr>
@@ -11380,7 +11380,7 @@
             <w:r>
               <w:drawing>
                 <wp:inline xmlns:a="http://schemas.openxmlformats.org/drawingml/2006/main" xmlns:pic="http://schemas.openxmlformats.org/drawingml/2006/picture">
-                  <wp:extent cx="504000" cy="340541"/>
+                  <wp:extent cx="504000" cy="216000"/>
                   <wp:docPr id="41" name="Picture 41"/>
                   <wp:cNvGraphicFramePr>
                     <a:graphicFrameLocks noChangeAspect="1"/>
@@ -11401,7 +11401,7 @@
                         <pic:spPr>
                           <a:xfrm>
                             <a:off x="0" y="0"/>
-                            <a:ext cx="504000" cy="340541"/>
+                            <a:ext cx="504000" cy="216000"/>
                           </a:xfrm>
                           <a:prstGeom prst="rect"/>
                         </pic:spPr>
@@ -11421,7 +11421,7 @@
                 <w:b/>
                 <w:sz w:val="26"/>
               </w:rPr>
-              <w:t>GREATER PRAISE SCHOOL SYSTEM</w:t>
+              <w:t>Suahco4</w:t>
             </w:r>
           </w:p>
           <w:p>
@@ -11445,7 +11445,7 @@
                 <w:b w:val="0"/>
                 <w:sz w:val="11"/>
               </w:rPr>
-              <w:t>Phone: 0775508030/0771241726 | Email:</w:t>
+              <w:t>Phone: 0778662590 | Email:</w:t>
             </w:r>
           </w:p>
           <w:p>
@@ -11467,7 +11467,7 @@
                 <w:color w:val="B8121B"/>
                 <w:sz w:val="16"/>
               </w:rPr>
-              <w:t>Receipt No: GPSS-080</w:t>
+              <w:t>Receipt No: SUAHCO4-080</w:t>
             </w:r>
             <w:r>
               <w:rPr>
@@ -11665,7 +11665,7 @@
             <w:r>
               <w:drawing>
                 <wp:inline xmlns:a="http://schemas.openxmlformats.org/drawingml/2006/main" xmlns:pic="http://schemas.openxmlformats.org/drawingml/2006/picture">
-                  <wp:extent cx="504000" cy="340541"/>
+                  <wp:extent cx="504000" cy="216000"/>
                   <wp:docPr id="42" name="Picture 42"/>
                   <wp:cNvGraphicFramePr>
                     <a:graphicFrameLocks noChangeAspect="1"/>
@@ -11686,7 +11686,7 @@
                         <pic:spPr>
                           <a:xfrm>
                             <a:off x="0" y="0"/>
-                            <a:ext cx="504000" cy="340541"/>
+                            <a:ext cx="504000" cy="216000"/>
                           </a:xfrm>
                           <a:prstGeom prst="rect"/>
                         </pic:spPr>
@@ -11706,7 +11706,7 @@
                 <w:b/>
                 <w:sz w:val="26"/>
               </w:rPr>
-              <w:t>GREATER PRAISE SCHOOL SYSTEM</w:t>
+              <w:t>Suahco4</w:t>
             </w:r>
           </w:p>
           <w:p>
@@ -11730,7 +11730,7 @@
                 <w:b w:val="0"/>
                 <w:sz w:val="11"/>
               </w:rPr>
-              <w:t>Phone: 0775508030/0771241726 | Email:</w:t>
+              <w:t>Phone: 0778662590 | Email:</w:t>
             </w:r>
           </w:p>
           <w:p>
@@ -11752,7 +11752,7 @@
                 <w:color w:val="B8121B"/>
                 <w:sz w:val="16"/>
               </w:rPr>
-              <w:t>Receipt No: GPSS-081</w:t>
+              <w:t>Receipt No: SUAHCO4-081</w:t>
             </w:r>
             <w:r>
               <w:rPr>
@@ -11946,7 +11946,7 @@
             <w:r>
               <w:drawing>
                 <wp:inline xmlns:a="http://schemas.openxmlformats.org/drawingml/2006/main" xmlns:pic="http://schemas.openxmlformats.org/drawingml/2006/picture">
-                  <wp:extent cx="504000" cy="340541"/>
+                  <wp:extent cx="504000" cy="216000"/>
                   <wp:docPr id="43" name="Picture 43"/>
                   <wp:cNvGraphicFramePr>
                     <a:graphicFrameLocks noChangeAspect="1"/>
@@ -11967,7 +11967,7 @@
                         <pic:spPr>
                           <a:xfrm>
                             <a:off x="0" y="0"/>
-                            <a:ext cx="504000" cy="340541"/>
+                            <a:ext cx="504000" cy="216000"/>
                           </a:xfrm>
                           <a:prstGeom prst="rect"/>
                         </pic:spPr>
@@ -11987,7 +11987,7 @@
                 <w:b/>
                 <w:sz w:val="26"/>
               </w:rPr>
-              <w:t>GREATER PRAISE SCHOOL SYSTEM</w:t>
+              <w:t>Suahco4</w:t>
             </w:r>
           </w:p>
           <w:p>
@@ -12011,7 +12011,7 @@
                 <w:b w:val="0"/>
                 <w:sz w:val="11"/>
               </w:rPr>
-              <w:t>Phone: 0775508030/0771241726 | Email:</w:t>
+              <w:t>Phone: 0778662590 | Email:</w:t>
             </w:r>
           </w:p>
           <w:p>
@@ -12033,7 +12033,7 @@
                 <w:color w:val="B8121B"/>
                 <w:sz w:val="16"/>
               </w:rPr>
-              <w:t>Receipt No: GPSS-082</w:t>
+              <w:t>Receipt No: SUAHCO4-082</w:t>
             </w:r>
             <w:r>
               <w:rPr>
@@ -12231,7 +12231,7 @@
             <w:r>
               <w:drawing>
                 <wp:inline xmlns:a="http://schemas.openxmlformats.org/drawingml/2006/main" xmlns:pic="http://schemas.openxmlformats.org/drawingml/2006/picture">
-                  <wp:extent cx="504000" cy="340541"/>
+                  <wp:extent cx="504000" cy="216000"/>
                   <wp:docPr id="44" name="Picture 44"/>
                   <wp:cNvGraphicFramePr>
                     <a:graphicFrameLocks noChangeAspect="1"/>
@@ -12252,7 +12252,7 @@
                         <pic:spPr>
                           <a:xfrm>
                             <a:off x="0" y="0"/>
-                            <a:ext cx="504000" cy="340541"/>
+                            <a:ext cx="504000" cy="216000"/>
                           </a:xfrm>
                           <a:prstGeom prst="rect"/>
                         </pic:spPr>
@@ -12272,7 +12272,7 @@
                 <w:b/>
                 <w:sz w:val="26"/>
               </w:rPr>
-              <w:t>GREATER PRAISE SCHOOL SYSTEM</w:t>
+              <w:t>Suahco4</w:t>
             </w:r>
           </w:p>
           <w:p>
@@ -12296,7 +12296,7 @@
                 <w:b w:val="0"/>
                 <w:sz w:val="11"/>
               </w:rPr>
-              <w:t>Phone: 0775508030/0771241726 | Email:</w:t>
+              <w:t>Phone: 0778662590 | Email:</w:t>
             </w:r>
           </w:p>
           <w:p>
@@ -12318,7 +12318,7 @@
                 <w:color w:val="B8121B"/>
                 <w:sz w:val="16"/>
               </w:rPr>
-              <w:t>Receipt No: GPSS-083</w:t>
+              <w:t>Receipt No: SUAHCO4-083</w:t>
             </w:r>
             <w:r>
               <w:rPr>
@@ -12516,7 +12516,7 @@
             <w:r>
               <w:drawing>
                 <wp:inline xmlns:a="http://schemas.openxmlformats.org/drawingml/2006/main" xmlns:pic="http://schemas.openxmlformats.org/drawingml/2006/picture">
-                  <wp:extent cx="504000" cy="340541"/>
+                  <wp:extent cx="504000" cy="216000"/>
                   <wp:docPr id="45" name="Picture 45"/>
                   <wp:cNvGraphicFramePr>
                     <a:graphicFrameLocks noChangeAspect="1"/>
@@ -12537,7 +12537,7 @@
                         <pic:spPr>
                           <a:xfrm>
                             <a:off x="0" y="0"/>
-                            <a:ext cx="504000" cy="340541"/>
+                            <a:ext cx="504000" cy="216000"/>
                           </a:xfrm>
                           <a:prstGeom prst="rect"/>
                         </pic:spPr>
@@ -12557,7 +12557,7 @@
                 <w:b/>
                 <w:sz w:val="26"/>
               </w:rPr>
-              <w:t>GREATER PRAISE SCHOOL SYSTEM</w:t>
+              <w:t>Suahco4</w:t>
             </w:r>
           </w:p>
           <w:p>
@@ -12581,7 +12581,7 @@
                 <w:b w:val="0"/>
                 <w:sz w:val="11"/>
               </w:rPr>
-              <w:t>Phone: 0775508030/0771241726 | Email:</w:t>
+              <w:t>Phone: 0778662590 | Email:</w:t>
             </w:r>
           </w:p>
           <w:p>
@@ -12603,7 +12603,7 @@
                 <w:color w:val="B8121B"/>
                 <w:sz w:val="16"/>
               </w:rPr>
-              <w:t>Receipt No: GPSS-084</w:t>
+              <w:t>Receipt No: SUAHCO4-084</w:t>
             </w:r>
             <w:r>
               <w:rPr>
@@ -12797,7 +12797,7 @@
             <w:r>
               <w:drawing>
                 <wp:inline xmlns:a="http://schemas.openxmlformats.org/drawingml/2006/main" xmlns:pic="http://schemas.openxmlformats.org/drawingml/2006/picture">
-                  <wp:extent cx="504000" cy="340541"/>
+                  <wp:extent cx="504000" cy="216000"/>
                   <wp:docPr id="46" name="Picture 46"/>
                   <wp:cNvGraphicFramePr>
                     <a:graphicFrameLocks noChangeAspect="1"/>
@@ -12818,7 +12818,7 @@
                         <pic:spPr>
                           <a:xfrm>
                             <a:off x="0" y="0"/>
-                            <a:ext cx="504000" cy="340541"/>
+                            <a:ext cx="504000" cy="216000"/>
                           </a:xfrm>
                           <a:prstGeom prst="rect"/>
                         </pic:spPr>
@@ -12838,7 +12838,7 @@
                 <w:b/>
                 <w:sz w:val="26"/>
               </w:rPr>
-              <w:t>GREATER PRAISE SCHOOL SYSTEM</w:t>
+              <w:t>Suahco4</w:t>
             </w:r>
           </w:p>
           <w:p>
@@ -12862,7 +12862,7 @@
                 <w:b w:val="0"/>
                 <w:sz w:val="11"/>
               </w:rPr>
-              <w:t>Phone: 0775508030/0771241726 | Email:</w:t>
+              <w:t>Phone: 0778662590 | Email:</w:t>
             </w:r>
           </w:p>
           <w:p>
@@ -12884,7 +12884,7 @@
                 <w:color w:val="B8121B"/>
                 <w:sz w:val="16"/>
               </w:rPr>
-              <w:t>Receipt No: GPSS-082</w:t>
+              <w:t>Receipt No: SUAHCO4-082</w:t>
             </w:r>
             <w:r>
               <w:rPr>
@@ -13082,7 +13082,7 @@
             <w:r>
               <w:drawing>
                 <wp:inline xmlns:a="http://schemas.openxmlformats.org/drawingml/2006/main" xmlns:pic="http://schemas.openxmlformats.org/drawingml/2006/picture">
-                  <wp:extent cx="504000" cy="340541"/>
+                  <wp:extent cx="504000" cy="216000"/>
                   <wp:docPr id="47" name="Picture 47"/>
                   <wp:cNvGraphicFramePr>
                     <a:graphicFrameLocks noChangeAspect="1"/>
@@ -13103,7 +13103,7 @@
                         <pic:spPr>
                           <a:xfrm>
                             <a:off x="0" y="0"/>
-                            <a:ext cx="504000" cy="340541"/>
+                            <a:ext cx="504000" cy="216000"/>
                           </a:xfrm>
                           <a:prstGeom prst="rect"/>
                         </pic:spPr>
@@ -13123,7 +13123,7 @@
                 <w:b/>
                 <w:sz w:val="26"/>
               </w:rPr>
-              <w:t>GREATER PRAISE SCHOOL SYSTEM</w:t>
+              <w:t>Suahco4</w:t>
             </w:r>
           </w:p>
           <w:p>
@@ -13147,7 +13147,7 @@
                 <w:b w:val="0"/>
                 <w:sz w:val="11"/>
               </w:rPr>
-              <w:t>Phone: 0775508030/0771241726 | Email:</w:t>
+              <w:t>Phone: 0778662590 | Email:</w:t>
             </w:r>
           </w:p>
           <w:p>
@@ -13169,7 +13169,7 @@
                 <w:color w:val="B8121B"/>
                 <w:sz w:val="16"/>
               </w:rPr>
-              <w:t>Receipt No: GPSS-083</w:t>
+              <w:t>Receipt No: SUAHCO4-083</w:t>
             </w:r>
             <w:r>
               <w:rPr>
@@ -13367,7 +13367,7 @@
             <w:r>
               <w:drawing>
                 <wp:inline xmlns:a="http://schemas.openxmlformats.org/drawingml/2006/main" xmlns:pic="http://schemas.openxmlformats.org/drawingml/2006/picture">
-                  <wp:extent cx="504000" cy="340541"/>
+                  <wp:extent cx="504000" cy="216000"/>
                   <wp:docPr id="48" name="Picture 48"/>
                   <wp:cNvGraphicFramePr>
                     <a:graphicFrameLocks noChangeAspect="1"/>
@@ -13388,7 +13388,7 @@
                         <pic:spPr>
                           <a:xfrm>
                             <a:off x="0" y="0"/>
-                            <a:ext cx="504000" cy="340541"/>
+                            <a:ext cx="504000" cy="216000"/>
                           </a:xfrm>
                           <a:prstGeom prst="rect"/>
                         </pic:spPr>
@@ -13408,7 +13408,7 @@
                 <w:b/>
                 <w:sz w:val="26"/>
               </w:rPr>
-              <w:t>GREATER PRAISE SCHOOL SYSTEM</w:t>
+              <w:t>Suahco4</w:t>
             </w:r>
           </w:p>
           <w:p>
@@ -13432,7 +13432,7 @@
                 <w:b w:val="0"/>
                 <w:sz w:val="11"/>
               </w:rPr>
-              <w:t>Phone: 0775508030/0771241726 | Email:</w:t>
+              <w:t>Phone: 0778662590 | Email:</w:t>
             </w:r>
           </w:p>
           <w:p>
@@ -13454,7 +13454,7 @@
                 <w:color w:val="B8121B"/>
                 <w:sz w:val="16"/>
               </w:rPr>
-              <w:t>Receipt No: GPSS-084</w:t>
+              <w:t>Receipt No: SUAHCO4-084</w:t>
             </w:r>
             <w:r>
               <w:rPr>
@@ -13648,7 +13648,7 @@
             <w:r>
               <w:drawing>
                 <wp:inline xmlns:a="http://schemas.openxmlformats.org/drawingml/2006/main" xmlns:pic="http://schemas.openxmlformats.org/drawingml/2006/picture">
-                  <wp:extent cx="504000" cy="340541"/>
+                  <wp:extent cx="504000" cy="216000"/>
                   <wp:docPr id="49" name="Picture 49"/>
                   <wp:cNvGraphicFramePr>
                     <a:graphicFrameLocks noChangeAspect="1"/>
@@ -13669,7 +13669,7 @@
                         <pic:spPr>
                           <a:xfrm>
                             <a:off x="0" y="0"/>
-                            <a:ext cx="504000" cy="340541"/>
+                            <a:ext cx="504000" cy="216000"/>
                           </a:xfrm>
                           <a:prstGeom prst="rect"/>
                         </pic:spPr>
@@ -13689,7 +13689,7 @@
                 <w:b/>
                 <w:sz w:val="26"/>
               </w:rPr>
-              <w:t>GREATER PRAISE SCHOOL SYSTEM</w:t>
+              <w:t>Suahco4</w:t>
             </w:r>
           </w:p>
           <w:p>
@@ -13713,7 +13713,7 @@
                 <w:b w:val="0"/>
                 <w:sz w:val="11"/>
               </w:rPr>
-              <w:t>Phone: 0775508030/0771241726 | Email:</w:t>
+              <w:t>Phone: 0778662590 | Email:</w:t>
             </w:r>
           </w:p>
           <w:p>
@@ -13735,7 +13735,7 @@
                 <w:color w:val="B8121B"/>
                 <w:sz w:val="16"/>
               </w:rPr>
-              <w:t>Receipt No: GPSS-085</w:t>
+              <w:t>Receipt No: SUAHCO4-085</w:t>
             </w:r>
             <w:r>
               <w:rPr>
@@ -13933,7 +13933,7 @@
             <w:r>
               <w:drawing>
                 <wp:inline xmlns:a="http://schemas.openxmlformats.org/drawingml/2006/main" xmlns:pic="http://schemas.openxmlformats.org/drawingml/2006/picture">
-                  <wp:extent cx="504000" cy="340541"/>
+                  <wp:extent cx="504000" cy="216000"/>
                   <wp:docPr id="50" name="Picture 50"/>
                   <wp:cNvGraphicFramePr>
                     <a:graphicFrameLocks noChangeAspect="1"/>
@@ -13954,7 +13954,7 @@
                         <pic:spPr>
                           <a:xfrm>
                             <a:off x="0" y="0"/>
-                            <a:ext cx="504000" cy="340541"/>
+                            <a:ext cx="504000" cy="216000"/>
                           </a:xfrm>
                           <a:prstGeom prst="rect"/>
                         </pic:spPr>
@@ -13974,7 +13974,7 @@
                 <w:b/>
                 <w:sz w:val="26"/>
               </w:rPr>
-              <w:t>GREATER PRAISE SCHOOL SYSTEM</w:t>
+              <w:t>Suahco4</w:t>
             </w:r>
           </w:p>
           <w:p>
@@ -13998,7 +13998,7 @@
                 <w:b w:val="0"/>
                 <w:sz w:val="11"/>
               </w:rPr>
-              <w:t>Phone: 0775508030/0771241726 | Email:</w:t>
+              <w:t>Phone: 0778662590 | Email:</w:t>
             </w:r>
           </w:p>
           <w:p>
@@ -14020,7 +14020,7 @@
                 <w:color w:val="B8121B"/>
                 <w:sz w:val="16"/>
               </w:rPr>
-              <w:t>Receipt No: GPSS-086</w:t>
+              <w:t>Receipt No: SUAHCO4-086</w:t>
             </w:r>
             <w:r>
               <w:rPr>
@@ -14218,7 +14218,7 @@
             <w:r>
               <w:drawing>
                 <wp:inline xmlns:a="http://schemas.openxmlformats.org/drawingml/2006/main" xmlns:pic="http://schemas.openxmlformats.org/drawingml/2006/picture">
-                  <wp:extent cx="504000" cy="340541"/>
+                  <wp:extent cx="504000" cy="216000"/>
                   <wp:docPr id="51" name="Picture 51"/>
                   <wp:cNvGraphicFramePr>
                     <a:graphicFrameLocks noChangeAspect="1"/>
@@ -14239,7 +14239,7 @@
                         <pic:spPr>
                           <a:xfrm>
                             <a:off x="0" y="0"/>
-                            <a:ext cx="504000" cy="340541"/>
+                            <a:ext cx="504000" cy="216000"/>
                           </a:xfrm>
                           <a:prstGeom prst="rect"/>
                         </pic:spPr>
@@ -14259,7 +14259,7 @@
                 <w:b/>
                 <w:sz w:val="26"/>
               </w:rPr>
-              <w:t>GREATER PRAISE SCHOOL SYSTEM</w:t>
+              <w:t>Suahco4</w:t>
             </w:r>
           </w:p>
           <w:p>
@@ -14283,7 +14283,7 @@
                 <w:b w:val="0"/>
                 <w:sz w:val="11"/>
               </w:rPr>
-              <w:t>Phone: 0775508030/0771241726 | Email:</w:t>
+              <w:t>Phone: 0778662590 | Email:</w:t>
             </w:r>
           </w:p>
           <w:p>
@@ -14305,7 +14305,7 @@
                 <w:color w:val="B8121B"/>
                 <w:sz w:val="16"/>
               </w:rPr>
-              <w:t>Receipt No: GPSS-087</w:t>
+              <w:t>Receipt No: SUAHCO4-087</w:t>
             </w:r>
             <w:r>
               <w:rPr>
@@ -14499,7 +14499,7 @@
             <w:r>
               <w:drawing>
                 <wp:inline xmlns:a="http://schemas.openxmlformats.org/drawingml/2006/main" xmlns:pic="http://schemas.openxmlformats.org/drawingml/2006/picture">
-                  <wp:extent cx="504000" cy="340541"/>
+                  <wp:extent cx="504000" cy="216000"/>
                   <wp:docPr id="52" name="Picture 52"/>
                   <wp:cNvGraphicFramePr>
                     <a:graphicFrameLocks noChangeAspect="1"/>
@@ -14520,7 +14520,7 @@
                         <pic:spPr>
                           <a:xfrm>
                             <a:off x="0" y="0"/>
-                            <a:ext cx="504000" cy="340541"/>
+                            <a:ext cx="504000" cy="216000"/>
                           </a:xfrm>
                           <a:prstGeom prst="rect"/>
                         </pic:spPr>
@@ -14540,7 +14540,7 @@
                 <w:b/>
                 <w:sz w:val="26"/>
               </w:rPr>
-              <w:t>GREATER PRAISE SCHOOL SYSTEM</w:t>
+              <w:t>Suahco4</w:t>
             </w:r>
           </w:p>
           <w:p>
@@ -14564,7 +14564,7 @@
                 <w:b w:val="0"/>
                 <w:sz w:val="11"/>
               </w:rPr>
-              <w:t>Phone: 0775508030/0771241726 | Email:</w:t>
+              <w:t>Phone: 0778662590 | Email:</w:t>
             </w:r>
           </w:p>
           <w:p>
@@ -14586,7 +14586,7 @@
                 <w:color w:val="B8121B"/>
                 <w:sz w:val="16"/>
               </w:rPr>
-              <w:t>Receipt No: GPSS-085</w:t>
+              <w:t>Receipt No: SUAHCO4-085</w:t>
             </w:r>
             <w:r>
               <w:rPr>
@@ -14784,7 +14784,7 @@
             <w:r>
               <w:drawing>
                 <wp:inline xmlns:a="http://schemas.openxmlformats.org/drawingml/2006/main" xmlns:pic="http://schemas.openxmlformats.org/drawingml/2006/picture">
-                  <wp:extent cx="504000" cy="340541"/>
+                  <wp:extent cx="504000" cy="216000"/>
                   <wp:docPr id="53" name="Picture 53"/>
                   <wp:cNvGraphicFramePr>
                     <a:graphicFrameLocks noChangeAspect="1"/>
@@ -14805,7 +14805,7 @@
                         <pic:spPr>
                           <a:xfrm>
                             <a:off x="0" y="0"/>
-                            <a:ext cx="504000" cy="340541"/>
+                            <a:ext cx="504000" cy="216000"/>
                           </a:xfrm>
                           <a:prstGeom prst="rect"/>
                         </pic:spPr>
@@ -14825,7 +14825,7 @@
                 <w:b/>
                 <w:sz w:val="26"/>
               </w:rPr>
-              <w:t>GREATER PRAISE SCHOOL SYSTEM</w:t>
+              <w:t>Suahco4</w:t>
             </w:r>
           </w:p>
           <w:p>
@@ -14849,7 +14849,7 @@
                 <w:b w:val="0"/>
                 <w:sz w:val="11"/>
               </w:rPr>
-              <w:t>Phone: 0775508030/0771241726 | Email:</w:t>
+              <w:t>Phone: 0778662590 | Email:</w:t>
             </w:r>
           </w:p>
           <w:p>
@@ -14871,7 +14871,7 @@
                 <w:color w:val="B8121B"/>
                 <w:sz w:val="16"/>
               </w:rPr>
-              <w:t>Receipt No: GPSS-086</w:t>
+              <w:t>Receipt No: SUAHCO4-086</w:t>
             </w:r>
             <w:r>
               <w:rPr>
@@ -15069,7 +15069,7 @@
             <w:r>
               <w:drawing>
                 <wp:inline xmlns:a="http://schemas.openxmlformats.org/drawingml/2006/main" xmlns:pic="http://schemas.openxmlformats.org/drawingml/2006/picture">
-                  <wp:extent cx="504000" cy="340541"/>
+                  <wp:extent cx="504000" cy="216000"/>
                   <wp:docPr id="54" name="Picture 54"/>
                   <wp:cNvGraphicFramePr>
                     <a:graphicFrameLocks noChangeAspect="1"/>
@@ -15090,7 +15090,7 @@
                         <pic:spPr>
                           <a:xfrm>
                             <a:off x="0" y="0"/>
-                            <a:ext cx="504000" cy="340541"/>
+                            <a:ext cx="504000" cy="216000"/>
                           </a:xfrm>
                           <a:prstGeom prst="rect"/>
                         </pic:spPr>
@@ -15110,7 +15110,7 @@
                 <w:b/>
                 <w:sz w:val="26"/>
               </w:rPr>
-              <w:t>GREATER PRAISE SCHOOL SYSTEM</w:t>
+              <w:t>Suahco4</w:t>
             </w:r>
           </w:p>
           <w:p>
@@ -15134,7 +15134,7 @@
                 <w:b w:val="0"/>
                 <w:sz w:val="11"/>
               </w:rPr>
-              <w:t>Phone: 0775508030/0771241726 | Email:</w:t>
+              <w:t>Phone: 0778662590 | Email:</w:t>
             </w:r>
           </w:p>
           <w:p>
@@ -15156,7 +15156,7 @@
                 <w:color w:val="B8121B"/>
                 <w:sz w:val="16"/>
               </w:rPr>
-              <w:t>Receipt No: GPSS-087</w:t>
+              <w:t>Receipt No: SUAHCO4-087</w:t>
             </w:r>
             <w:r>
               <w:rPr>
@@ -15350,7 +15350,7 @@
             <w:r>
               <w:drawing>
                 <wp:inline xmlns:a="http://schemas.openxmlformats.org/drawingml/2006/main" xmlns:pic="http://schemas.openxmlformats.org/drawingml/2006/picture">
-                  <wp:extent cx="504000" cy="340541"/>
+                  <wp:extent cx="504000" cy="216000"/>
                   <wp:docPr id="55" name="Picture 55"/>
                   <wp:cNvGraphicFramePr>
                     <a:graphicFrameLocks noChangeAspect="1"/>
@@ -15371,7 +15371,7 @@
                         <pic:spPr>
                           <a:xfrm>
                             <a:off x="0" y="0"/>
-                            <a:ext cx="504000" cy="340541"/>
+                            <a:ext cx="504000" cy="216000"/>
                           </a:xfrm>
                           <a:prstGeom prst="rect"/>
                         </pic:spPr>
@@ -15391,7 +15391,7 @@
                 <w:b/>
                 <w:sz w:val="26"/>
               </w:rPr>
-              <w:t>GREATER PRAISE SCHOOL SYSTEM</w:t>
+              <w:t>Suahco4</w:t>
             </w:r>
           </w:p>
           <w:p>
@@ -15415,7 +15415,7 @@
                 <w:b w:val="0"/>
                 <w:sz w:val="11"/>
               </w:rPr>
-              <w:t>Phone: 0775508030/0771241726 | Email:</w:t>
+              <w:t>Phone: 0778662590 | Email:</w:t>
             </w:r>
           </w:p>
           <w:p>
@@ -15437,7 +15437,7 @@
                 <w:color w:val="B8121B"/>
                 <w:sz w:val="16"/>
               </w:rPr>
-              <w:t>Receipt No: GPSS-088</w:t>
+              <w:t>Receipt No: SUAHCO4-088</w:t>
             </w:r>
             <w:r>
               <w:rPr>
@@ -15635,7 +15635,7 @@
             <w:r>
               <w:drawing>
                 <wp:inline xmlns:a="http://schemas.openxmlformats.org/drawingml/2006/main" xmlns:pic="http://schemas.openxmlformats.org/drawingml/2006/picture">
-                  <wp:extent cx="504000" cy="340541"/>
+                  <wp:extent cx="504000" cy="216000"/>
                   <wp:docPr id="56" name="Picture 56"/>
                   <wp:cNvGraphicFramePr>
                     <a:graphicFrameLocks noChangeAspect="1"/>
@@ -15656,7 +15656,7 @@
                         <pic:spPr>
                           <a:xfrm>
                             <a:off x="0" y="0"/>
-                            <a:ext cx="504000" cy="340541"/>
+                            <a:ext cx="504000" cy="216000"/>
                           </a:xfrm>
                           <a:prstGeom prst="rect"/>
                         </pic:spPr>
@@ -15676,7 +15676,7 @@
                 <w:b/>
                 <w:sz w:val="26"/>
               </w:rPr>
-              <w:t>GREATER PRAISE SCHOOL SYSTEM</w:t>
+              <w:t>Suahco4</w:t>
             </w:r>
           </w:p>
           <w:p>
@@ -15700,7 +15700,7 @@
                 <w:b w:val="0"/>
                 <w:sz w:val="11"/>
               </w:rPr>
-              <w:t>Phone: 0775508030/0771241726 | Email:</w:t>
+              <w:t>Phone: 0778662590 | Email:</w:t>
             </w:r>
           </w:p>
           <w:p>
@@ -15722,7 +15722,7 @@
                 <w:color w:val="B8121B"/>
                 <w:sz w:val="16"/>
               </w:rPr>
-              <w:t>Receipt No: GPSS-089</w:t>
+              <w:t>Receipt No: SUAHCO4-089</w:t>
             </w:r>
             <w:r>
               <w:rPr>
@@ -15920,7 +15920,7 @@
             <w:r>
               <w:drawing>
                 <wp:inline xmlns:a="http://schemas.openxmlformats.org/drawingml/2006/main" xmlns:pic="http://schemas.openxmlformats.org/drawingml/2006/picture">
-                  <wp:extent cx="504000" cy="340541"/>
+                  <wp:extent cx="504000" cy="216000"/>
                   <wp:docPr id="57" name="Picture 57"/>
                   <wp:cNvGraphicFramePr>
                     <a:graphicFrameLocks noChangeAspect="1"/>
@@ -15941,7 +15941,7 @@
                         <pic:spPr>
                           <a:xfrm>
                             <a:off x="0" y="0"/>
-                            <a:ext cx="504000" cy="340541"/>
+                            <a:ext cx="504000" cy="216000"/>
                           </a:xfrm>
                           <a:prstGeom prst="rect"/>
                         </pic:spPr>
@@ -15961,7 +15961,7 @@
                 <w:b/>
                 <w:sz w:val="26"/>
               </w:rPr>
-              <w:t>GREATER PRAISE SCHOOL SYSTEM</w:t>
+              <w:t>Suahco4</w:t>
             </w:r>
           </w:p>
           <w:p>
@@ -15985,7 +15985,7 @@
                 <w:b w:val="0"/>
                 <w:sz w:val="11"/>
               </w:rPr>
-              <w:t>Phone: 0775508030/0771241726 | Email:</w:t>
+              <w:t>Phone: 0778662590 | Email:</w:t>
             </w:r>
           </w:p>
           <w:p>
@@ -16007,7 +16007,7 @@
                 <w:color w:val="B8121B"/>
                 <w:sz w:val="16"/>
               </w:rPr>
-              <w:t>Receipt No: GPSS-090</w:t>
+              <w:t>Receipt No: SUAHCO4-090</w:t>
             </w:r>
             <w:r>
               <w:rPr>
@@ -16201,7 +16201,7 @@
             <w:r>
               <w:drawing>
                 <wp:inline xmlns:a="http://schemas.openxmlformats.org/drawingml/2006/main" xmlns:pic="http://schemas.openxmlformats.org/drawingml/2006/picture">
-                  <wp:extent cx="504000" cy="340541"/>
+                  <wp:extent cx="504000" cy="216000"/>
                   <wp:docPr id="58" name="Picture 58"/>
                   <wp:cNvGraphicFramePr>
                     <a:graphicFrameLocks noChangeAspect="1"/>
@@ -16222,7 +16222,7 @@
                         <pic:spPr>
                           <a:xfrm>
                             <a:off x="0" y="0"/>
-                            <a:ext cx="504000" cy="340541"/>
+                            <a:ext cx="504000" cy="216000"/>
                           </a:xfrm>
                           <a:prstGeom prst="rect"/>
                         </pic:spPr>
@@ -16242,7 +16242,7 @@
                 <w:b/>
                 <w:sz w:val="26"/>
               </w:rPr>
-              <w:t>GREATER PRAISE SCHOOL SYSTEM</w:t>
+              <w:t>Suahco4</w:t>
             </w:r>
           </w:p>
           <w:p>
@@ -16266,7 +16266,7 @@
                 <w:b w:val="0"/>
                 <w:sz w:val="11"/>
               </w:rPr>
-              <w:t>Phone: 0775508030/0771241726 | Email:</w:t>
+              <w:t>Phone: 0778662590 | Email:</w:t>
             </w:r>
           </w:p>
           <w:p>
@@ -16288,7 +16288,7 @@
                 <w:color w:val="B8121B"/>
                 <w:sz w:val="16"/>
               </w:rPr>
-              <w:t>Receipt No: GPSS-088</w:t>
+              <w:t>Receipt No: SUAHCO4-088</w:t>
             </w:r>
             <w:r>
               <w:rPr>
@@ -16486,7 +16486,7 @@
             <w:r>
               <w:drawing>
                 <wp:inline xmlns:a="http://schemas.openxmlformats.org/drawingml/2006/main" xmlns:pic="http://schemas.openxmlformats.org/drawingml/2006/picture">
-                  <wp:extent cx="504000" cy="340541"/>
+                  <wp:extent cx="504000" cy="216000"/>
                   <wp:docPr id="59" name="Picture 59"/>
                   <wp:cNvGraphicFramePr>
                     <a:graphicFrameLocks noChangeAspect="1"/>
@@ -16507,7 +16507,7 @@
                         <pic:spPr>
                           <a:xfrm>
                             <a:off x="0" y="0"/>
-                            <a:ext cx="504000" cy="340541"/>
+                            <a:ext cx="504000" cy="216000"/>
                           </a:xfrm>
                           <a:prstGeom prst="rect"/>
                         </pic:spPr>
@@ -16527,7 +16527,7 @@
                 <w:b/>
                 <w:sz w:val="26"/>
               </w:rPr>
-              <w:t>GREATER PRAISE SCHOOL SYSTEM</w:t>
+              <w:t>Suahco4</w:t>
             </w:r>
           </w:p>
           <w:p>
@@ -16551,7 +16551,7 @@
                 <w:b w:val="0"/>
                 <w:sz w:val="11"/>
               </w:rPr>
-              <w:t>Phone: 0775508030/0771241726 | Email:</w:t>
+              <w:t>Phone: 0778662590 | Email:</w:t>
             </w:r>
           </w:p>
           <w:p>
@@ -16573,7 +16573,7 @@
                 <w:color w:val="B8121B"/>
                 <w:sz w:val="16"/>
               </w:rPr>
-              <w:t>Receipt No: GPSS-089</w:t>
+              <w:t>Receipt No: SUAHCO4-089</w:t>
             </w:r>
             <w:r>
               <w:rPr>
@@ -16771,7 +16771,7 @@
             <w:r>
               <w:drawing>
                 <wp:inline xmlns:a="http://schemas.openxmlformats.org/drawingml/2006/main" xmlns:pic="http://schemas.openxmlformats.org/drawingml/2006/picture">
-                  <wp:extent cx="504000" cy="340541"/>
+                  <wp:extent cx="504000" cy="216000"/>
                   <wp:docPr id="60" name="Picture 60"/>
                   <wp:cNvGraphicFramePr>
                     <a:graphicFrameLocks noChangeAspect="1"/>
@@ -16792,7 +16792,7 @@
                         <pic:spPr>
                           <a:xfrm>
                             <a:off x="0" y="0"/>
-                            <a:ext cx="504000" cy="340541"/>
+                            <a:ext cx="504000" cy="216000"/>
                           </a:xfrm>
                           <a:prstGeom prst="rect"/>
                         </pic:spPr>
@@ -16812,7 +16812,7 @@
                 <w:b/>
                 <w:sz w:val="26"/>
               </w:rPr>
-              <w:t>GREATER PRAISE SCHOOL SYSTEM</w:t>
+              <w:t>Suahco4</w:t>
             </w:r>
           </w:p>
           <w:p>
@@ -16836,7 +16836,7 @@
                 <w:b w:val="0"/>
                 <w:sz w:val="11"/>
               </w:rPr>
-              <w:t>Phone: 0775508030/0771241726 | Email:</w:t>
+              <w:t>Phone: 0778662590 | Email:</w:t>
             </w:r>
           </w:p>
           <w:p>
@@ -16858,7 +16858,7 @@
                 <w:color w:val="B8121B"/>
                 <w:sz w:val="16"/>
               </w:rPr>
-              <w:t>Receipt No: GPSS-090</w:t>
+              <w:t>Receipt No: SUAHCO4-090</w:t>
             </w:r>
             <w:r>
               <w:rPr>
@@ -17052,7 +17052,7 @@
             <w:r>
               <w:drawing>
                 <wp:inline xmlns:a="http://schemas.openxmlformats.org/drawingml/2006/main" xmlns:pic="http://schemas.openxmlformats.org/drawingml/2006/picture">
-                  <wp:extent cx="504000" cy="340541"/>
+                  <wp:extent cx="504000" cy="216000"/>
                   <wp:docPr id="61" name="Picture 61"/>
                   <wp:cNvGraphicFramePr>
                     <a:graphicFrameLocks noChangeAspect="1"/>
@@ -17073,7 +17073,7 @@
                         <pic:spPr>
                           <a:xfrm>
                             <a:off x="0" y="0"/>
-                            <a:ext cx="504000" cy="340541"/>
+                            <a:ext cx="504000" cy="216000"/>
                           </a:xfrm>
                           <a:prstGeom prst="rect"/>
                         </pic:spPr>
@@ -17093,7 +17093,7 @@
                 <w:b/>
                 <w:sz w:val="26"/>
               </w:rPr>
-              <w:t>GREATER PRAISE SCHOOL SYSTEM</w:t>
+              <w:t>Suahco4</w:t>
             </w:r>
           </w:p>
           <w:p>
@@ -17117,7 +17117,7 @@
                 <w:b w:val="0"/>
                 <w:sz w:val="11"/>
               </w:rPr>
-              <w:t>Phone: 0775508030/0771241726 | Email:</w:t>
+              <w:t>Phone: 0778662590 | Email:</w:t>
             </w:r>
           </w:p>
           <w:p>
@@ -17139,7 +17139,7 @@
                 <w:color w:val="B8121B"/>
                 <w:sz w:val="16"/>
               </w:rPr>
-              <w:t>Receipt No: GPSS-091</w:t>
+              <w:t>Receipt No: SUAHCO4-091</w:t>
             </w:r>
             <w:r>
               <w:rPr>
@@ -17337,7 +17337,7 @@
             <w:r>
               <w:drawing>
                 <wp:inline xmlns:a="http://schemas.openxmlformats.org/drawingml/2006/main" xmlns:pic="http://schemas.openxmlformats.org/drawingml/2006/picture">
-                  <wp:extent cx="504000" cy="340541"/>
+                  <wp:extent cx="504000" cy="216000"/>
                   <wp:docPr id="62" name="Picture 62"/>
                   <wp:cNvGraphicFramePr>
                     <a:graphicFrameLocks noChangeAspect="1"/>
@@ -17358,7 +17358,7 @@
                         <pic:spPr>
                           <a:xfrm>
                             <a:off x="0" y="0"/>
-                            <a:ext cx="504000" cy="340541"/>
+                            <a:ext cx="504000" cy="216000"/>
                           </a:xfrm>
                           <a:prstGeom prst="rect"/>
                         </pic:spPr>
@@ -17378,7 +17378,7 @@
                 <w:b/>
                 <w:sz w:val="26"/>
               </w:rPr>
-              <w:t>GREATER PRAISE SCHOOL SYSTEM</w:t>
+              <w:t>Suahco4</w:t>
             </w:r>
           </w:p>
           <w:p>
@@ -17402,7 +17402,7 @@
                 <w:b w:val="0"/>
                 <w:sz w:val="11"/>
               </w:rPr>
-              <w:t>Phone: 0775508030/0771241726 | Email:</w:t>
+              <w:t>Phone: 0778662590 | Email:</w:t>
             </w:r>
           </w:p>
           <w:p>
@@ -17424,7 +17424,7 @@
                 <w:color w:val="B8121B"/>
                 <w:sz w:val="16"/>
               </w:rPr>
-              <w:t>Receipt No: GPSS-092</w:t>
+              <w:t>Receipt No: SUAHCO4-092</w:t>
             </w:r>
             <w:r>
               <w:rPr>
@@ -17622,7 +17622,7 @@
             <w:r>
               <w:drawing>
                 <wp:inline xmlns:a="http://schemas.openxmlformats.org/drawingml/2006/main" xmlns:pic="http://schemas.openxmlformats.org/drawingml/2006/picture">
-                  <wp:extent cx="504000" cy="340541"/>
+                  <wp:extent cx="504000" cy="216000"/>
                   <wp:docPr id="63" name="Picture 63"/>
                   <wp:cNvGraphicFramePr>
                     <a:graphicFrameLocks noChangeAspect="1"/>
@@ -17643,7 +17643,7 @@
                         <pic:spPr>
                           <a:xfrm>
                             <a:off x="0" y="0"/>
-                            <a:ext cx="504000" cy="340541"/>
+                            <a:ext cx="504000" cy="216000"/>
                           </a:xfrm>
                           <a:prstGeom prst="rect"/>
                         </pic:spPr>
@@ -17663,7 +17663,7 @@
                 <w:b/>
                 <w:sz w:val="26"/>
               </w:rPr>
-              <w:t>GREATER PRAISE SCHOOL SYSTEM</w:t>
+              <w:t>Suahco4</w:t>
             </w:r>
           </w:p>
           <w:p>
@@ -17687,7 +17687,7 @@
                 <w:b w:val="0"/>
                 <w:sz w:val="11"/>
               </w:rPr>
-              <w:t>Phone: 0775508030/0771241726 | Email:</w:t>
+              <w:t>Phone: 0778662590 | Email:</w:t>
             </w:r>
           </w:p>
           <w:p>
@@ -17709,7 +17709,7 @@
                 <w:color w:val="B8121B"/>
                 <w:sz w:val="16"/>
               </w:rPr>
-              <w:t>Receipt No: GPSS-093</w:t>
+              <w:t>Receipt No: SUAHCO4-093</w:t>
             </w:r>
             <w:r>
               <w:rPr>
@@ -17903,7 +17903,7 @@
             <w:r>
               <w:drawing>
                 <wp:inline xmlns:a="http://schemas.openxmlformats.org/drawingml/2006/main" xmlns:pic="http://schemas.openxmlformats.org/drawingml/2006/picture">
-                  <wp:extent cx="504000" cy="340541"/>
+                  <wp:extent cx="504000" cy="216000"/>
                   <wp:docPr id="64" name="Picture 64"/>
                   <wp:cNvGraphicFramePr>
                     <a:graphicFrameLocks noChangeAspect="1"/>
@@ -17924,7 +17924,7 @@
                         <pic:spPr>
                           <a:xfrm>
                             <a:off x="0" y="0"/>
-                            <a:ext cx="504000" cy="340541"/>
+                            <a:ext cx="504000" cy="216000"/>
                           </a:xfrm>
                           <a:prstGeom prst="rect"/>
                         </pic:spPr>
@@ -17944,7 +17944,7 @@
                 <w:b/>
                 <w:sz w:val="26"/>
               </w:rPr>
-              <w:t>GREATER PRAISE SCHOOL SYSTEM</w:t>
+              <w:t>Suahco4</w:t>
             </w:r>
           </w:p>
           <w:p>
@@ -17968,7 +17968,7 @@
                 <w:b w:val="0"/>
                 <w:sz w:val="11"/>
               </w:rPr>
-              <w:t>Phone: 0775508030/0771241726 | Email:</w:t>
+              <w:t>Phone: 0778662590 | Email:</w:t>
             </w:r>
           </w:p>
           <w:p>
@@ -17990,7 +17990,7 @@
                 <w:color w:val="B8121B"/>
                 <w:sz w:val="16"/>
               </w:rPr>
-              <w:t>Receipt No: GPSS-091</w:t>
+              <w:t>Receipt No: SUAHCO4-091</w:t>
             </w:r>
             <w:r>
               <w:rPr>
@@ -18188,7 +18188,7 @@
             <w:r>
               <w:drawing>
                 <wp:inline xmlns:a="http://schemas.openxmlformats.org/drawingml/2006/main" xmlns:pic="http://schemas.openxmlformats.org/drawingml/2006/picture">
-                  <wp:extent cx="504000" cy="340541"/>
+                  <wp:extent cx="504000" cy="216000"/>
                   <wp:docPr id="65" name="Picture 65"/>
                   <wp:cNvGraphicFramePr>
                     <a:graphicFrameLocks noChangeAspect="1"/>
@@ -18209,7 +18209,7 @@
                         <pic:spPr>
                           <a:xfrm>
                             <a:off x="0" y="0"/>
-                            <a:ext cx="504000" cy="340541"/>
+                            <a:ext cx="504000" cy="216000"/>
                           </a:xfrm>
                           <a:prstGeom prst="rect"/>
                         </pic:spPr>
@@ -18229,7 +18229,7 @@
                 <w:b/>
                 <w:sz w:val="26"/>
               </w:rPr>
-              <w:t>GREATER PRAISE SCHOOL SYSTEM</w:t>
+              <w:t>Suahco4</w:t>
             </w:r>
           </w:p>
           <w:p>
@@ -18253,7 +18253,7 @@
                 <w:b w:val="0"/>
                 <w:sz w:val="11"/>
               </w:rPr>
-              <w:t>Phone: 0775508030/0771241726 | Email:</w:t>
+              <w:t>Phone: 0778662590 | Email:</w:t>
             </w:r>
           </w:p>
           <w:p>
@@ -18275,7 +18275,7 @@
                 <w:color w:val="B8121B"/>
                 <w:sz w:val="16"/>
               </w:rPr>
-              <w:t>Receipt No: GPSS-092</w:t>
+              <w:t>Receipt No: SUAHCO4-092</w:t>
             </w:r>
             <w:r>
               <w:rPr>
@@ -18473,7 +18473,7 @@
             <w:r>
               <w:drawing>
                 <wp:inline xmlns:a="http://schemas.openxmlformats.org/drawingml/2006/main" xmlns:pic="http://schemas.openxmlformats.org/drawingml/2006/picture">
-                  <wp:extent cx="504000" cy="340541"/>
+                  <wp:extent cx="504000" cy="216000"/>
                   <wp:docPr id="66" name="Picture 66"/>
                   <wp:cNvGraphicFramePr>
                     <a:graphicFrameLocks noChangeAspect="1"/>
@@ -18494,7 +18494,7 @@
                         <pic:spPr>
                           <a:xfrm>
                             <a:off x="0" y="0"/>
-                            <a:ext cx="504000" cy="340541"/>
+                            <a:ext cx="504000" cy="216000"/>
                           </a:xfrm>
                           <a:prstGeom prst="rect"/>
                         </pic:spPr>
@@ -18514,7 +18514,7 @@
                 <w:b/>
                 <w:sz w:val="26"/>
               </w:rPr>
-              <w:t>GREATER PRAISE SCHOOL SYSTEM</w:t>
+              <w:t>Suahco4</w:t>
             </w:r>
           </w:p>
           <w:p>
@@ -18538,7 +18538,7 @@
                 <w:b w:val="0"/>
                 <w:sz w:val="11"/>
               </w:rPr>
-              <w:t>Phone: 0775508030/0771241726 | Email:</w:t>
+              <w:t>Phone: 0778662590 | Email:</w:t>
             </w:r>
           </w:p>
           <w:p>
@@ -18560,7 +18560,7 @@
                 <w:color w:val="B8121B"/>
                 <w:sz w:val="16"/>
               </w:rPr>
-              <w:t>Receipt No: GPSS-093</w:t>
+              <w:t>Receipt No: SUAHCO4-093</w:t>
             </w:r>
             <w:r>
               <w:rPr>
@@ -18754,7 +18754,7 @@
             <w:r>
               <w:drawing>
                 <wp:inline xmlns:a="http://schemas.openxmlformats.org/drawingml/2006/main" xmlns:pic="http://schemas.openxmlformats.org/drawingml/2006/picture">
-                  <wp:extent cx="504000" cy="340541"/>
+                  <wp:extent cx="504000" cy="216000"/>
                   <wp:docPr id="67" name="Picture 67"/>
                   <wp:cNvGraphicFramePr>
                     <a:graphicFrameLocks noChangeAspect="1"/>
@@ -18775,7 +18775,7 @@
                         <pic:spPr>
                           <a:xfrm>
                             <a:off x="0" y="0"/>
-                            <a:ext cx="504000" cy="340541"/>
+                            <a:ext cx="504000" cy="216000"/>
                           </a:xfrm>
                           <a:prstGeom prst="rect"/>
                         </pic:spPr>
@@ -18795,7 +18795,7 @@
                 <w:b/>
                 <w:sz w:val="26"/>
               </w:rPr>
-              <w:t>GREATER PRAISE SCHOOL SYSTEM</w:t>
+              <w:t>Suahco4</w:t>
             </w:r>
           </w:p>
           <w:p>
@@ -18819,7 +18819,7 @@
                 <w:b w:val="0"/>
                 <w:sz w:val="11"/>
               </w:rPr>
-              <w:t>Phone: 0775508030/0771241726 | Email:</w:t>
+              <w:t>Phone: 0778662590 | Email:</w:t>
             </w:r>
           </w:p>
           <w:p>
@@ -18841,7 +18841,7 @@
                 <w:color w:val="B8121B"/>
                 <w:sz w:val="16"/>
               </w:rPr>
-              <w:t>Receipt No: GPSS-094</w:t>
+              <w:t>Receipt No: SUAHCO4-094</w:t>
             </w:r>
             <w:r>
               <w:rPr>
@@ -19039,7 +19039,7 @@
             <w:r>
               <w:drawing>
                 <wp:inline xmlns:a="http://schemas.openxmlformats.org/drawingml/2006/main" xmlns:pic="http://schemas.openxmlformats.org/drawingml/2006/picture">
-                  <wp:extent cx="504000" cy="340541"/>
+                  <wp:extent cx="504000" cy="216000"/>
                   <wp:docPr id="68" name="Picture 68"/>
                   <wp:cNvGraphicFramePr>
                     <a:graphicFrameLocks noChangeAspect="1"/>
@@ -19060,7 +19060,7 @@
                         <pic:spPr>
                           <a:xfrm>
                             <a:off x="0" y="0"/>
-                            <a:ext cx="504000" cy="340541"/>
+                            <a:ext cx="504000" cy="216000"/>
                           </a:xfrm>
                           <a:prstGeom prst="rect"/>
                         </pic:spPr>
@@ -19080,7 +19080,7 @@
                 <w:b/>
                 <w:sz w:val="26"/>
               </w:rPr>
-              <w:t>GREATER PRAISE SCHOOL SYSTEM</w:t>
+              <w:t>Suahco4</w:t>
             </w:r>
           </w:p>
           <w:p>
@@ -19104,7 +19104,7 @@
                 <w:b w:val="0"/>
                 <w:sz w:val="11"/>
               </w:rPr>
-              <w:t>Phone: 0775508030/0771241726 | Email:</w:t>
+              <w:t>Phone: 0778662590 | Email:</w:t>
             </w:r>
           </w:p>
           <w:p>
@@ -19126,7 +19126,7 @@
                 <w:color w:val="B8121B"/>
                 <w:sz w:val="16"/>
               </w:rPr>
-              <w:t>Receipt No: GPSS-095</w:t>
+              <w:t>Receipt No: SUAHCO4-095</w:t>
             </w:r>
             <w:r>
               <w:rPr>
@@ -19324,7 +19324,7 @@
             <w:r>
               <w:drawing>
                 <wp:inline xmlns:a="http://schemas.openxmlformats.org/drawingml/2006/main" xmlns:pic="http://schemas.openxmlformats.org/drawingml/2006/picture">
-                  <wp:extent cx="504000" cy="340541"/>
+                  <wp:extent cx="504000" cy="216000"/>
                   <wp:docPr id="69" name="Picture 69"/>
                   <wp:cNvGraphicFramePr>
                     <a:graphicFrameLocks noChangeAspect="1"/>
@@ -19345,7 +19345,7 @@
                         <pic:spPr>
                           <a:xfrm>
                             <a:off x="0" y="0"/>
-                            <a:ext cx="504000" cy="340541"/>
+                            <a:ext cx="504000" cy="216000"/>
                           </a:xfrm>
                           <a:prstGeom prst="rect"/>
                         </pic:spPr>
@@ -19365,7 +19365,7 @@
                 <w:b/>
                 <w:sz w:val="26"/>
               </w:rPr>
-              <w:t>GREATER PRAISE SCHOOL SYSTEM</w:t>
+              <w:t>Suahco4</w:t>
             </w:r>
           </w:p>
           <w:p>
@@ -19389,7 +19389,7 @@
                 <w:b w:val="0"/>
                 <w:sz w:val="11"/>
               </w:rPr>
-              <w:t>Phone: 0775508030/0771241726 | Email:</w:t>
+              <w:t>Phone: 0778662590 | Email:</w:t>
             </w:r>
           </w:p>
           <w:p>
@@ -19411,7 +19411,7 @@
                 <w:color w:val="B8121B"/>
                 <w:sz w:val="16"/>
               </w:rPr>
-              <w:t>Receipt No: GPSS-096</w:t>
+              <w:t>Receipt No: SUAHCO4-096</w:t>
             </w:r>
             <w:r>
               <w:rPr>
@@ -19605,7 +19605,7 @@
             <w:r>
               <w:drawing>
                 <wp:inline xmlns:a="http://schemas.openxmlformats.org/drawingml/2006/main" xmlns:pic="http://schemas.openxmlformats.org/drawingml/2006/picture">
-                  <wp:extent cx="504000" cy="340541"/>
+                  <wp:extent cx="504000" cy="216000"/>
                   <wp:docPr id="70" name="Picture 70"/>
                   <wp:cNvGraphicFramePr>
                     <a:graphicFrameLocks noChangeAspect="1"/>
@@ -19626,7 +19626,7 @@
                         <pic:spPr>
                           <a:xfrm>
                             <a:off x="0" y="0"/>
-                            <a:ext cx="504000" cy="340541"/>
+                            <a:ext cx="504000" cy="216000"/>
                           </a:xfrm>
                           <a:prstGeom prst="rect"/>
                         </pic:spPr>
@@ -19646,7 +19646,7 @@
                 <w:b/>
                 <w:sz w:val="26"/>
               </w:rPr>
-              <w:t>GREATER PRAISE SCHOOL SYSTEM</w:t>
+              <w:t>Suahco4</w:t>
             </w:r>
           </w:p>
           <w:p>
@@ -19670,7 +19670,7 @@
                 <w:b w:val="0"/>
                 <w:sz w:val="11"/>
               </w:rPr>
-              <w:t>Phone: 0775508030/0771241726 | Email:</w:t>
+              <w:t>Phone: 0778662590 | Email:</w:t>
             </w:r>
           </w:p>
           <w:p>
@@ -19692,7 +19692,7 @@
                 <w:color w:val="B8121B"/>
                 <w:sz w:val="16"/>
               </w:rPr>
-              <w:t>Receipt No: GPSS-094</w:t>
+              <w:t>Receipt No: SUAHCO4-094</w:t>
             </w:r>
             <w:r>
               <w:rPr>
@@ -19890,7 +19890,7 @@
             <w:r>
               <w:drawing>
                 <wp:inline xmlns:a="http://schemas.openxmlformats.org/drawingml/2006/main" xmlns:pic="http://schemas.openxmlformats.org/drawingml/2006/picture">
-                  <wp:extent cx="504000" cy="340541"/>
+                  <wp:extent cx="504000" cy="216000"/>
                   <wp:docPr id="71" name="Picture 71"/>
                   <wp:cNvGraphicFramePr>
                     <a:graphicFrameLocks noChangeAspect="1"/>
@@ -19911,7 +19911,7 @@
                         <pic:spPr>
                           <a:xfrm>
                             <a:off x="0" y="0"/>
-                            <a:ext cx="504000" cy="340541"/>
+                            <a:ext cx="504000" cy="216000"/>
                           </a:xfrm>
                           <a:prstGeom prst="rect"/>
                         </pic:spPr>
@@ -19931,7 +19931,7 @@
                 <w:b/>
                 <w:sz w:val="26"/>
               </w:rPr>
-              <w:t>GREATER PRAISE SCHOOL SYSTEM</w:t>
+              <w:t>Suahco4</w:t>
             </w:r>
           </w:p>
           <w:p>
@@ -19955,7 +19955,7 @@
                 <w:b w:val="0"/>
                 <w:sz w:val="11"/>
               </w:rPr>
-              <w:t>Phone: 0775508030/0771241726 | Email:</w:t>
+              <w:t>Phone: 0778662590 | Email:</w:t>
             </w:r>
           </w:p>
           <w:p>
@@ -19977,7 +19977,7 @@
                 <w:color w:val="B8121B"/>
                 <w:sz w:val="16"/>
               </w:rPr>
-              <w:t>Receipt No: GPSS-095</w:t>
+              <w:t>Receipt No: SUAHCO4-095</w:t>
             </w:r>
             <w:r>
               <w:rPr>
@@ -20175,7 +20175,7 @@
             <w:r>
               <w:drawing>
                 <wp:inline xmlns:a="http://schemas.openxmlformats.org/drawingml/2006/main" xmlns:pic="http://schemas.openxmlformats.org/drawingml/2006/picture">
-                  <wp:extent cx="504000" cy="340541"/>
+                  <wp:extent cx="504000" cy="216000"/>
                   <wp:docPr id="72" name="Picture 72"/>
                   <wp:cNvGraphicFramePr>
                     <a:graphicFrameLocks noChangeAspect="1"/>
@@ -20196,7 +20196,7 @@
                         <pic:spPr>
                           <a:xfrm>
                             <a:off x="0" y="0"/>
-                            <a:ext cx="504000" cy="340541"/>
+                            <a:ext cx="504000" cy="216000"/>
                           </a:xfrm>
                           <a:prstGeom prst="rect"/>
                         </pic:spPr>
@@ -20216,7 +20216,7 @@
                 <w:b/>
                 <w:sz w:val="26"/>
               </w:rPr>
-              <w:t>GREATER PRAISE SCHOOL SYSTEM</w:t>
+              <w:t>Suahco4</w:t>
             </w:r>
           </w:p>
           <w:p>
@@ -20240,7 +20240,7 @@
                 <w:b w:val="0"/>
                 <w:sz w:val="11"/>
               </w:rPr>
-              <w:t>Phone: 0775508030/0771241726 | Email:</w:t>
+              <w:t>Phone: 0778662590 | Email:</w:t>
             </w:r>
           </w:p>
           <w:p>
@@ -20262,7 +20262,7 @@
                 <w:color w:val="B8121B"/>
                 <w:sz w:val="16"/>
               </w:rPr>
-              <w:t>Receipt No: GPSS-096</w:t>
+              <w:t>Receipt No: SUAHCO4-096</w:t>
             </w:r>
             <w:r>
               <w:rPr>
@@ -20456,7 +20456,7 @@
             <w:r>
               <w:drawing>
                 <wp:inline xmlns:a="http://schemas.openxmlformats.org/drawingml/2006/main" xmlns:pic="http://schemas.openxmlformats.org/drawingml/2006/picture">
-                  <wp:extent cx="504000" cy="340541"/>
+                  <wp:extent cx="504000" cy="216000"/>
                   <wp:docPr id="73" name="Picture 73"/>
                   <wp:cNvGraphicFramePr>
                     <a:graphicFrameLocks noChangeAspect="1"/>
@@ -20477,7 +20477,7 @@
                         <pic:spPr>
                           <a:xfrm>
                             <a:off x="0" y="0"/>
-                            <a:ext cx="504000" cy="340541"/>
+                            <a:ext cx="504000" cy="216000"/>
                           </a:xfrm>
                           <a:prstGeom prst="rect"/>
                         </pic:spPr>
@@ -20497,7 +20497,7 @@
                 <w:b/>
                 <w:sz w:val="26"/>
               </w:rPr>
-              <w:t>GREATER PRAISE SCHOOL SYSTEM</w:t>
+              <w:t>Suahco4</w:t>
             </w:r>
           </w:p>
           <w:p>
@@ -20521,7 +20521,7 @@
                 <w:b w:val="0"/>
                 <w:sz w:val="11"/>
               </w:rPr>
-              <w:t>Phone: 0775508030/0771241726 | Email:</w:t>
+              <w:t>Phone: 0778662590 | Email:</w:t>
             </w:r>
           </w:p>
           <w:p>
@@ -20543,7 +20543,7 @@
                 <w:color w:val="B8121B"/>
                 <w:sz w:val="16"/>
               </w:rPr>
-              <w:t>Receipt No: GPSS-097</w:t>
+              <w:t>Receipt No: SUAHCO4-097</w:t>
             </w:r>
             <w:r>
               <w:rPr>
@@ -20741,7 +20741,7 @@
             <w:r>
               <w:drawing>
                 <wp:inline xmlns:a="http://schemas.openxmlformats.org/drawingml/2006/main" xmlns:pic="http://schemas.openxmlformats.org/drawingml/2006/picture">
-                  <wp:extent cx="504000" cy="340541"/>
+                  <wp:extent cx="504000" cy="216000"/>
                   <wp:docPr id="74" name="Picture 74"/>
                   <wp:cNvGraphicFramePr>
                     <a:graphicFrameLocks noChangeAspect="1"/>
@@ -20762,7 +20762,7 @@
                         <pic:spPr>
                           <a:xfrm>
                             <a:off x="0" y="0"/>
-                            <a:ext cx="504000" cy="340541"/>
+                            <a:ext cx="504000" cy="216000"/>
                           </a:xfrm>
                           <a:prstGeom prst="rect"/>
                         </pic:spPr>
@@ -20782,7 +20782,7 @@
                 <w:b/>
                 <w:sz w:val="26"/>
               </w:rPr>
-              <w:t>GREATER PRAISE SCHOOL SYSTEM</w:t>
+              <w:t>Suahco4</w:t>
             </w:r>
           </w:p>
           <w:p>
@@ -20806,7 +20806,7 @@
                 <w:b w:val="0"/>
                 <w:sz w:val="11"/>
               </w:rPr>
-              <w:t>Phone: 0775508030/0771241726 | Email:</w:t>
+              <w:t>Phone: 0778662590 | Email:</w:t>
             </w:r>
           </w:p>
           <w:p>
@@ -20828,7 +20828,7 @@
                 <w:color w:val="B8121B"/>
                 <w:sz w:val="16"/>
               </w:rPr>
-              <w:t>Receipt No: GPSS-098</w:t>
+              <w:t>Receipt No: SUAHCO4-098</w:t>
             </w:r>
             <w:r>
               <w:rPr>
@@ -21026,7 +21026,7 @@
             <w:r>
               <w:drawing>
                 <wp:inline xmlns:a="http://schemas.openxmlformats.org/drawingml/2006/main" xmlns:pic="http://schemas.openxmlformats.org/drawingml/2006/picture">
-                  <wp:extent cx="504000" cy="340541"/>
+                  <wp:extent cx="504000" cy="216000"/>
                   <wp:docPr id="75" name="Picture 75"/>
                   <wp:cNvGraphicFramePr>
                     <a:graphicFrameLocks noChangeAspect="1"/>
@@ -21047,7 +21047,7 @@
                         <pic:spPr>
                           <a:xfrm>
                             <a:off x="0" y="0"/>
-                            <a:ext cx="504000" cy="340541"/>
+                            <a:ext cx="504000" cy="216000"/>
                           </a:xfrm>
                           <a:prstGeom prst="rect"/>
                         </pic:spPr>
@@ -21067,7 +21067,7 @@
                 <w:b/>
                 <w:sz w:val="26"/>
               </w:rPr>
-              <w:t>GREATER PRAISE SCHOOL SYSTEM</w:t>
+              <w:t>Suahco4</w:t>
             </w:r>
           </w:p>
           <w:p>
@@ -21091,7 +21091,7 @@
                 <w:b w:val="0"/>
                 <w:sz w:val="11"/>
               </w:rPr>
-              <w:t>Phone: 0775508030/0771241726 | Email:</w:t>
+              <w:t>Phone: 0778662590 | Email:</w:t>
             </w:r>
           </w:p>
           <w:p>
@@ -21113,7 +21113,7 @@
                 <w:color w:val="B8121B"/>
                 <w:sz w:val="16"/>
               </w:rPr>
-              <w:t>Receipt No: GPSS-099</w:t>
+              <w:t>Receipt No: SUAHCO4-099</w:t>
             </w:r>
             <w:r>
               <w:rPr>
@@ -21307,7 +21307,7 @@
             <w:r>
               <w:drawing>
                 <wp:inline xmlns:a="http://schemas.openxmlformats.org/drawingml/2006/main" xmlns:pic="http://schemas.openxmlformats.org/drawingml/2006/picture">
-                  <wp:extent cx="504000" cy="340541"/>
+                  <wp:extent cx="504000" cy="216000"/>
                   <wp:docPr id="76" name="Picture 76"/>
                   <wp:cNvGraphicFramePr>
                     <a:graphicFrameLocks noChangeAspect="1"/>
@@ -21328,7 +21328,7 @@
                         <pic:spPr>
                           <a:xfrm>
                             <a:off x="0" y="0"/>
-                            <a:ext cx="504000" cy="340541"/>
+                            <a:ext cx="504000" cy="216000"/>
                           </a:xfrm>
                           <a:prstGeom prst="rect"/>
                         </pic:spPr>
@@ -21348,7 +21348,7 @@
                 <w:b/>
                 <w:sz w:val="26"/>
               </w:rPr>
-              <w:t>GREATER PRAISE SCHOOL SYSTEM</w:t>
+              <w:t>Suahco4</w:t>
             </w:r>
           </w:p>
           <w:p>
@@ -21372,7 +21372,7 @@
                 <w:b w:val="0"/>
                 <w:sz w:val="11"/>
               </w:rPr>
-              <w:t>Phone: 0775508030/0771241726 | Email:</w:t>
+              <w:t>Phone: 0778662590 | Email:</w:t>
             </w:r>
           </w:p>
           <w:p>
@@ -21394,7 +21394,7 @@
                 <w:color w:val="B8121B"/>
                 <w:sz w:val="16"/>
               </w:rPr>
-              <w:t>Receipt No: GPSS-097</w:t>
+              <w:t>Receipt No: SUAHCO4-097</w:t>
             </w:r>
             <w:r>
               <w:rPr>
@@ -21592,7 +21592,7 @@
             <w:r>
               <w:drawing>
                 <wp:inline xmlns:a="http://schemas.openxmlformats.org/drawingml/2006/main" xmlns:pic="http://schemas.openxmlformats.org/drawingml/2006/picture">
-                  <wp:extent cx="504000" cy="340541"/>
+                  <wp:extent cx="504000" cy="216000"/>
                   <wp:docPr id="77" name="Picture 77"/>
                   <wp:cNvGraphicFramePr>
                     <a:graphicFrameLocks noChangeAspect="1"/>
@@ -21613,7 +21613,7 @@
                         <pic:spPr>
                           <a:xfrm>
                             <a:off x="0" y="0"/>
-                            <a:ext cx="504000" cy="340541"/>
+                            <a:ext cx="504000" cy="216000"/>
                           </a:xfrm>
                           <a:prstGeom prst="rect"/>
                         </pic:spPr>
@@ -21633,7 +21633,7 @@
                 <w:b/>
                 <w:sz w:val="26"/>
               </w:rPr>
-              <w:t>GREATER PRAISE SCHOOL SYSTEM</w:t>
+              <w:t>Suahco4</w:t>
             </w:r>
           </w:p>
           <w:p>
@@ -21657,7 +21657,7 @@
                 <w:b w:val="0"/>
                 <w:sz w:val="11"/>
               </w:rPr>
-              <w:t>Phone: 0775508030/0771241726 | Email:</w:t>
+              <w:t>Phone: 0778662590 | Email:</w:t>
             </w:r>
           </w:p>
           <w:p>
@@ -21679,7 +21679,7 @@
                 <w:color w:val="B8121B"/>
                 <w:sz w:val="16"/>
               </w:rPr>
-              <w:t>Receipt No: GPSS-098</w:t>
+              <w:t>Receipt No: SUAHCO4-098</w:t>
             </w:r>
             <w:r>
               <w:rPr>
@@ -21877,7 +21877,7 @@
             <w:r>
               <w:drawing>
                 <wp:inline xmlns:a="http://schemas.openxmlformats.org/drawingml/2006/main" xmlns:pic="http://schemas.openxmlformats.org/drawingml/2006/picture">
-                  <wp:extent cx="504000" cy="340541"/>
+                  <wp:extent cx="504000" cy="216000"/>
                   <wp:docPr id="78" name="Picture 78"/>
                   <wp:cNvGraphicFramePr>
                     <a:graphicFrameLocks noChangeAspect="1"/>
@@ -21898,7 +21898,7 @@
                         <pic:spPr>
                           <a:xfrm>
                             <a:off x="0" y="0"/>
-                            <a:ext cx="504000" cy="340541"/>
+                            <a:ext cx="504000" cy="216000"/>
                           </a:xfrm>
                           <a:prstGeom prst="rect"/>
                         </pic:spPr>
@@ -21918,7 +21918,7 @@
                 <w:b/>
                 <w:sz w:val="26"/>
               </w:rPr>
-              <w:t>GREATER PRAISE SCHOOL SYSTEM</w:t>
+              <w:t>Suahco4</w:t>
             </w:r>
           </w:p>
           <w:p>
@@ -21942,7 +21942,7 @@
                 <w:b w:val="0"/>
                 <w:sz w:val="11"/>
               </w:rPr>
-              <w:t>Phone: 0775508030/0771241726 | Email:</w:t>
+              <w:t>Phone: 0778662590 | Email:</w:t>
             </w:r>
           </w:p>
           <w:p>
@@ -21964,7 +21964,7 @@
                 <w:color w:val="B8121B"/>
                 <w:sz w:val="16"/>
               </w:rPr>
-              <w:t>Receipt No: GPSS-099</w:t>
+              <w:t>Receipt No: SUAHCO4-099</w:t>
             </w:r>
             <w:r>
               <w:rPr>
@@ -22158,7 +22158,7 @@
             <w:r>
               <w:drawing>
                 <wp:inline xmlns:a="http://schemas.openxmlformats.org/drawingml/2006/main" xmlns:pic="http://schemas.openxmlformats.org/drawingml/2006/picture">
-                  <wp:extent cx="504000" cy="340541"/>
+                  <wp:extent cx="504000" cy="216000"/>
                   <wp:docPr id="79" name="Picture 79"/>
                   <wp:cNvGraphicFramePr>
                     <a:graphicFrameLocks noChangeAspect="1"/>
@@ -22179,7 +22179,7 @@
                         <pic:spPr>
                           <a:xfrm>
                             <a:off x="0" y="0"/>
-                            <a:ext cx="504000" cy="340541"/>
+                            <a:ext cx="504000" cy="216000"/>
                           </a:xfrm>
                           <a:prstGeom prst="rect"/>
                         </pic:spPr>
@@ -22199,7 +22199,7 @@
                 <w:b/>
                 <w:sz w:val="26"/>
               </w:rPr>
-              <w:t>GREATER PRAISE SCHOOL SYSTEM</w:t>
+              <w:t>Suahco4</w:t>
             </w:r>
           </w:p>
           <w:p>
@@ -22223,7 +22223,7 @@
                 <w:b w:val="0"/>
                 <w:sz w:val="11"/>
               </w:rPr>
-              <w:t>Phone: 0775508030/0771241726 | Email:</w:t>
+              <w:t>Phone: 0778662590 | Email:</w:t>
             </w:r>
           </w:p>
           <w:p>
@@ -22245,7 +22245,7 @@
                 <w:color w:val="B8121B"/>
                 <w:sz w:val="16"/>
               </w:rPr>
-              <w:t>Receipt No: GPSS-100</w:t>
+              <w:t>Receipt No: SUAHCO4-100</w:t>
             </w:r>
             <w:r>
               <w:rPr>
@@ -22443,7 +22443,7 @@
             <w:r>
               <w:drawing>
                 <wp:inline xmlns:a="http://schemas.openxmlformats.org/drawingml/2006/main" xmlns:pic="http://schemas.openxmlformats.org/drawingml/2006/picture">
-                  <wp:extent cx="504000" cy="340541"/>
+                  <wp:extent cx="504000" cy="216000"/>
                   <wp:docPr id="80" name="Picture 80"/>
                   <wp:cNvGraphicFramePr>
                     <a:graphicFrameLocks noChangeAspect="1"/>
@@ -22464,7 +22464,7 @@
                         <pic:spPr>
                           <a:xfrm>
                             <a:off x="0" y="0"/>
-                            <a:ext cx="504000" cy="340541"/>
+                            <a:ext cx="504000" cy="216000"/>
                           </a:xfrm>
                           <a:prstGeom prst="rect"/>
                         </pic:spPr>
@@ -22484,7 +22484,7 @@
                 <w:b/>
                 <w:sz w:val="26"/>
               </w:rPr>
-              <w:t>GREATER PRAISE SCHOOL SYSTEM</w:t>
+              <w:t>Suahco4</w:t>
             </w:r>
           </w:p>
           <w:p>
@@ -22508,7 +22508,7 @@
                 <w:b w:val="0"/>
                 <w:sz w:val="11"/>
               </w:rPr>
-              <w:t>Phone: 0775508030/0771241726 | Email:</w:t>
+              <w:t>Phone: 0778662590 | Email:</w:t>
             </w:r>
           </w:p>
           <w:p>
@@ -22530,7 +22530,7 @@
                 <w:color w:val="B8121B"/>
                 <w:sz w:val="16"/>
               </w:rPr>
-              <w:t>Receipt No: GPSS-101</w:t>
+              <w:t>Receipt No: SUAHCO4-101</w:t>
             </w:r>
             <w:r>
               <w:rPr>
@@ -22728,7 +22728,7 @@
             <w:r>
               <w:drawing>
                 <wp:inline xmlns:a="http://schemas.openxmlformats.org/drawingml/2006/main" xmlns:pic="http://schemas.openxmlformats.org/drawingml/2006/picture">
-                  <wp:extent cx="504000" cy="340541"/>
+                  <wp:extent cx="504000" cy="216000"/>
                   <wp:docPr id="81" name="Picture 81"/>
                   <wp:cNvGraphicFramePr>
                     <a:graphicFrameLocks noChangeAspect="1"/>
@@ -22749,7 +22749,7 @@
                         <pic:spPr>
                           <a:xfrm>
                             <a:off x="0" y="0"/>
-                            <a:ext cx="504000" cy="340541"/>
+                            <a:ext cx="504000" cy="216000"/>
                           </a:xfrm>
                           <a:prstGeom prst="rect"/>
                         </pic:spPr>
@@ -22769,7 +22769,7 @@
                 <w:b/>
                 <w:sz w:val="26"/>
               </w:rPr>
-              <w:t>GREATER PRAISE SCHOOL SYSTEM</w:t>
+              <w:t>Suahco4</w:t>
             </w:r>
           </w:p>
           <w:p>
@@ -22793,7 +22793,7 @@
                 <w:b w:val="0"/>
                 <w:sz w:val="11"/>
               </w:rPr>
-              <w:t>Phone: 0775508030/0771241726 | Email:</w:t>
+              <w:t>Phone: 0778662590 | Email:</w:t>
             </w:r>
           </w:p>
           <w:p>
@@ -22815,7 +22815,7 @@
                 <w:color w:val="B8121B"/>
                 <w:sz w:val="16"/>
               </w:rPr>
-              <w:t>Receipt No: GPSS-102</w:t>
+              <w:t>Receipt No: SUAHCO4-102</w:t>
             </w:r>
             <w:r>
               <w:rPr>
@@ -23009,7 +23009,7 @@
             <w:r>
               <w:drawing>
                 <wp:inline xmlns:a="http://schemas.openxmlformats.org/drawingml/2006/main" xmlns:pic="http://schemas.openxmlformats.org/drawingml/2006/picture">
-                  <wp:extent cx="504000" cy="340541"/>
+                  <wp:extent cx="504000" cy="216000"/>
                   <wp:docPr id="82" name="Picture 82"/>
                   <wp:cNvGraphicFramePr>
                     <a:graphicFrameLocks noChangeAspect="1"/>
@@ -23030,7 +23030,7 @@
                         <pic:spPr>
                           <a:xfrm>
                             <a:off x="0" y="0"/>
-                            <a:ext cx="504000" cy="340541"/>
+                            <a:ext cx="504000" cy="216000"/>
                           </a:xfrm>
                           <a:prstGeom prst="rect"/>
                         </pic:spPr>
@@ -23050,7 +23050,7 @@
                 <w:b/>
                 <w:sz w:val="26"/>
               </w:rPr>
-              <w:t>GREATER PRAISE SCHOOL SYSTEM</w:t>
+              <w:t>Suahco4</w:t>
             </w:r>
           </w:p>
           <w:p>
@@ -23074,7 +23074,7 @@
                 <w:b w:val="0"/>
                 <w:sz w:val="11"/>
               </w:rPr>
-              <w:t>Phone: 0775508030/0771241726 | Email:</w:t>
+              <w:t>Phone: 0778662590 | Email:</w:t>
             </w:r>
           </w:p>
           <w:p>
@@ -23096,7 +23096,7 @@
                 <w:color w:val="B8121B"/>
                 <w:sz w:val="16"/>
               </w:rPr>
-              <w:t>Receipt No: GPSS-100</w:t>
+              <w:t>Receipt No: SUAHCO4-100</w:t>
             </w:r>
             <w:r>
               <w:rPr>
@@ -23294,7 +23294,7 @@
             <w:r>
               <w:drawing>
                 <wp:inline xmlns:a="http://schemas.openxmlformats.org/drawingml/2006/main" xmlns:pic="http://schemas.openxmlformats.org/drawingml/2006/picture">
-                  <wp:extent cx="504000" cy="340541"/>
+                  <wp:extent cx="504000" cy="216000"/>
                   <wp:docPr id="83" name="Picture 83"/>
                   <wp:cNvGraphicFramePr>
                     <a:graphicFrameLocks noChangeAspect="1"/>
@@ -23315,7 +23315,7 @@
                         <pic:spPr>
                           <a:xfrm>
                             <a:off x="0" y="0"/>
-                            <a:ext cx="504000" cy="340541"/>
+                            <a:ext cx="504000" cy="216000"/>
                           </a:xfrm>
                           <a:prstGeom prst="rect"/>
                         </pic:spPr>
@@ -23335,7 +23335,7 @@
                 <w:b/>
                 <w:sz w:val="26"/>
               </w:rPr>
-              <w:t>GREATER PRAISE SCHOOL SYSTEM</w:t>
+              <w:t>Suahco4</w:t>
             </w:r>
           </w:p>
           <w:p>
@@ -23359,7 +23359,7 @@
                 <w:b w:val="0"/>
                 <w:sz w:val="11"/>
               </w:rPr>
-              <w:t>Phone: 0775508030/0771241726 | Email:</w:t>
+              <w:t>Phone: 0778662590 | Email:</w:t>
             </w:r>
           </w:p>
           <w:p>
@@ -23381,7 +23381,7 @@
                 <w:color w:val="B8121B"/>
                 <w:sz w:val="16"/>
               </w:rPr>
-              <w:t>Receipt No: GPSS-101</w:t>
+              <w:t>Receipt No: SUAHCO4-101</w:t>
             </w:r>
             <w:r>
               <w:rPr>
@@ -23579,7 +23579,7 @@
             <w:r>
               <w:drawing>
                 <wp:inline xmlns:a="http://schemas.openxmlformats.org/drawingml/2006/main" xmlns:pic="http://schemas.openxmlformats.org/drawingml/2006/picture">
-                  <wp:extent cx="504000" cy="340541"/>
+                  <wp:extent cx="504000" cy="216000"/>
                   <wp:docPr id="84" name="Picture 84"/>
                   <wp:cNvGraphicFramePr>
                     <a:graphicFrameLocks noChangeAspect="1"/>
@@ -23600,7 +23600,7 @@
                         <pic:spPr>
                           <a:xfrm>
                             <a:off x="0" y="0"/>
-                            <a:ext cx="504000" cy="340541"/>
+                            <a:ext cx="504000" cy="216000"/>
                           </a:xfrm>
                           <a:prstGeom prst="rect"/>
                         </pic:spPr>
@@ -23620,7 +23620,7 @@
                 <w:b/>
                 <w:sz w:val="26"/>
               </w:rPr>
-              <w:t>GREATER PRAISE SCHOOL SYSTEM</w:t>
+              <w:t>Suahco4</w:t>
             </w:r>
           </w:p>
           <w:p>
@@ -23644,7 +23644,7 @@
                 <w:b w:val="0"/>
                 <w:sz w:val="11"/>
               </w:rPr>
-              <w:t>Phone: 0775508030/0771241726 | Email:</w:t>
+              <w:t>Phone: 0778662590 | Email:</w:t>
             </w:r>
           </w:p>
           <w:p>
@@ -23666,7 +23666,7 @@
                 <w:color w:val="B8121B"/>
                 <w:sz w:val="16"/>
               </w:rPr>
-              <w:t>Receipt No: GPSS-102</w:t>
+              <w:t>Receipt No: SUAHCO4-102</w:t>
             </w:r>
             <w:r>
               <w:rPr>
@@ -23860,7 +23860,7 @@
             <w:r>
               <w:drawing>
                 <wp:inline xmlns:a="http://schemas.openxmlformats.org/drawingml/2006/main" xmlns:pic="http://schemas.openxmlformats.org/drawingml/2006/picture">
-                  <wp:extent cx="504000" cy="340541"/>
+                  <wp:extent cx="504000" cy="216000"/>
                   <wp:docPr id="85" name="Picture 85"/>
                   <wp:cNvGraphicFramePr>
                     <a:graphicFrameLocks noChangeAspect="1"/>
@@ -23881,7 +23881,7 @@
                         <pic:spPr>
                           <a:xfrm>
                             <a:off x="0" y="0"/>
-                            <a:ext cx="504000" cy="340541"/>
+                            <a:ext cx="504000" cy="216000"/>
                           </a:xfrm>
                           <a:prstGeom prst="rect"/>
                         </pic:spPr>
@@ -23901,7 +23901,7 @@
                 <w:b/>
                 <w:sz w:val="26"/>
               </w:rPr>
-              <w:t>GREATER PRAISE SCHOOL SYSTEM</w:t>
+              <w:t>Suahco4</w:t>
             </w:r>
           </w:p>
           <w:p>
@@ -23925,7 +23925,7 @@
                 <w:b w:val="0"/>
                 <w:sz w:val="11"/>
               </w:rPr>
-              <w:t>Phone: 0775508030/0771241726 | Email:</w:t>
+              <w:t>Phone: 0778662590 | Email:</w:t>
             </w:r>
           </w:p>
           <w:p>
@@ -23947,7 +23947,7 @@
                 <w:color w:val="B8121B"/>
                 <w:sz w:val="16"/>
               </w:rPr>
-              <w:t>Receipt No: GPSS-103</w:t>
+              <w:t>Receipt No: SUAHCO4-103</w:t>
             </w:r>
             <w:r>
               <w:rPr>
@@ -24145,7 +24145,7 @@
             <w:r>
               <w:drawing>
                 <wp:inline xmlns:a="http://schemas.openxmlformats.org/drawingml/2006/main" xmlns:pic="http://schemas.openxmlformats.org/drawingml/2006/picture">
-                  <wp:extent cx="504000" cy="340541"/>
+                  <wp:extent cx="504000" cy="216000"/>
                   <wp:docPr id="86" name="Picture 86"/>
                   <wp:cNvGraphicFramePr>
                     <a:graphicFrameLocks noChangeAspect="1"/>
@@ -24166,7 +24166,7 @@
                         <pic:spPr>
                           <a:xfrm>
                             <a:off x="0" y="0"/>
-                            <a:ext cx="504000" cy="340541"/>
+                            <a:ext cx="504000" cy="216000"/>
                           </a:xfrm>
                           <a:prstGeom prst="rect"/>
                         </pic:spPr>
@@ -24186,7 +24186,7 @@
                 <w:b/>
                 <w:sz w:val="26"/>
               </w:rPr>
-              <w:t>GREATER PRAISE SCHOOL SYSTEM</w:t>
+              <w:t>Suahco4</w:t>
             </w:r>
           </w:p>
           <w:p>
@@ -24210,7 +24210,7 @@
                 <w:b w:val="0"/>
                 <w:sz w:val="11"/>
               </w:rPr>
-              <w:t>Phone: 0775508030/0771241726 | Email:</w:t>
+              <w:t>Phone: 0778662590 | Email:</w:t>
             </w:r>
           </w:p>
           <w:p>
@@ -24232,7 +24232,7 @@
                 <w:color w:val="B8121B"/>
                 <w:sz w:val="16"/>
               </w:rPr>
-              <w:t>Receipt No: GPSS-104</w:t>
+              <w:t>Receipt No: SUAHCO4-104</w:t>
             </w:r>
             <w:r>
               <w:rPr>
@@ -24430,7 +24430,7 @@
             <w:r>
               <w:drawing>
                 <wp:inline xmlns:a="http://schemas.openxmlformats.org/drawingml/2006/main" xmlns:pic="http://schemas.openxmlformats.org/drawingml/2006/picture">
-                  <wp:extent cx="504000" cy="340541"/>
+                  <wp:extent cx="504000" cy="216000"/>
                   <wp:docPr id="87" name="Picture 87"/>
                   <wp:cNvGraphicFramePr>
                     <a:graphicFrameLocks noChangeAspect="1"/>
@@ -24451,7 +24451,7 @@
                         <pic:spPr>
                           <a:xfrm>
                             <a:off x="0" y="0"/>
-                            <a:ext cx="504000" cy="340541"/>
+                            <a:ext cx="504000" cy="216000"/>
                           </a:xfrm>
                           <a:prstGeom prst="rect"/>
                         </pic:spPr>
@@ -24471,7 +24471,7 @@
                 <w:b/>
                 <w:sz w:val="26"/>
               </w:rPr>
-              <w:t>GREATER PRAISE SCHOOL SYSTEM</w:t>
+              <w:t>Suahco4</w:t>
             </w:r>
           </w:p>
           <w:p>
@@ -24495,7 +24495,7 @@
                 <w:b w:val="0"/>
                 <w:sz w:val="11"/>
               </w:rPr>
-              <w:t>Phone: 0775508030/0771241726 | Email:</w:t>
+              <w:t>Phone: 0778662590 | Email:</w:t>
             </w:r>
           </w:p>
           <w:p>
@@ -24517,7 +24517,7 @@
                 <w:color w:val="B8121B"/>
                 <w:sz w:val="16"/>
               </w:rPr>
-              <w:t>Receipt No: GPSS-105</w:t>
+              <w:t>Receipt No: SUAHCO4-105</w:t>
             </w:r>
             <w:r>
               <w:rPr>
@@ -24711,7 +24711,7 @@
             <w:r>
               <w:drawing>
                 <wp:inline xmlns:a="http://schemas.openxmlformats.org/drawingml/2006/main" xmlns:pic="http://schemas.openxmlformats.org/drawingml/2006/picture">
-                  <wp:extent cx="504000" cy="340541"/>
+                  <wp:extent cx="504000" cy="216000"/>
                   <wp:docPr id="88" name="Picture 88"/>
                   <wp:cNvGraphicFramePr>
                     <a:graphicFrameLocks noChangeAspect="1"/>
@@ -24732,7 +24732,7 @@
                         <pic:spPr>
                           <a:xfrm>
                             <a:off x="0" y="0"/>
-                            <a:ext cx="504000" cy="340541"/>
+                            <a:ext cx="504000" cy="216000"/>
                           </a:xfrm>
                           <a:prstGeom prst="rect"/>
                         </pic:spPr>
@@ -24752,7 +24752,7 @@
                 <w:b/>
                 <w:sz w:val="26"/>
               </w:rPr>
-              <w:t>GREATER PRAISE SCHOOL SYSTEM</w:t>
+              <w:t>Suahco4</w:t>
             </w:r>
           </w:p>
           <w:p>
@@ -24776,7 +24776,7 @@
                 <w:b w:val="0"/>
                 <w:sz w:val="11"/>
               </w:rPr>
-              <w:t>Phone: 0775508030/0771241726 | Email:</w:t>
+              <w:t>Phone: 0778662590 | Email:</w:t>
             </w:r>
           </w:p>
           <w:p>
@@ -24798,7 +24798,7 @@
                 <w:color w:val="B8121B"/>
                 <w:sz w:val="16"/>
               </w:rPr>
-              <w:t>Receipt No: GPSS-103</w:t>
+              <w:t>Receipt No: SUAHCO4-103</w:t>
             </w:r>
             <w:r>
               <w:rPr>
@@ -24996,7 +24996,7 @@
             <w:r>
               <w:drawing>
                 <wp:inline xmlns:a="http://schemas.openxmlformats.org/drawingml/2006/main" xmlns:pic="http://schemas.openxmlformats.org/drawingml/2006/picture">
-                  <wp:extent cx="504000" cy="340541"/>
+                  <wp:extent cx="504000" cy="216000"/>
                   <wp:docPr id="89" name="Picture 89"/>
                   <wp:cNvGraphicFramePr>
                     <a:graphicFrameLocks noChangeAspect="1"/>
@@ -25017,7 +25017,7 @@
                         <pic:spPr>
                           <a:xfrm>
                             <a:off x="0" y="0"/>
-                            <a:ext cx="504000" cy="340541"/>
+                            <a:ext cx="504000" cy="216000"/>
                           </a:xfrm>
                           <a:prstGeom prst="rect"/>
                         </pic:spPr>
@@ -25037,7 +25037,7 @@
                 <w:b/>
                 <w:sz w:val="26"/>
               </w:rPr>
-              <w:t>GREATER PRAISE SCHOOL SYSTEM</w:t>
+              <w:t>Suahco4</w:t>
             </w:r>
           </w:p>
           <w:p>
@@ -25061,7 +25061,7 @@
                 <w:b w:val="0"/>
                 <w:sz w:val="11"/>
               </w:rPr>
-              <w:t>Phone: 0775508030/0771241726 | Email:</w:t>
+              <w:t>Phone: 0778662590 | Email:</w:t>
             </w:r>
           </w:p>
           <w:p>
@@ -25083,7 +25083,7 @@
                 <w:color w:val="B8121B"/>
                 <w:sz w:val="16"/>
               </w:rPr>
-              <w:t>Receipt No: GPSS-104</w:t>
+              <w:t>Receipt No: SUAHCO4-104</w:t>
             </w:r>
             <w:r>
               <w:rPr>
@@ -25281,7 +25281,7 @@
             <w:r>
               <w:drawing>
                 <wp:inline xmlns:a="http://schemas.openxmlformats.org/drawingml/2006/main" xmlns:pic="http://schemas.openxmlformats.org/drawingml/2006/picture">
-                  <wp:extent cx="504000" cy="340541"/>
+                  <wp:extent cx="504000" cy="216000"/>
                   <wp:docPr id="90" name="Picture 90"/>
                   <wp:cNvGraphicFramePr>
                     <a:graphicFrameLocks noChangeAspect="1"/>
@@ -25302,7 +25302,7 @@
                         <pic:spPr>
                           <a:xfrm>
                             <a:off x="0" y="0"/>
-                            <a:ext cx="504000" cy="340541"/>
+                            <a:ext cx="504000" cy="216000"/>
                           </a:xfrm>
                           <a:prstGeom prst="rect"/>
                         </pic:spPr>
@@ -25322,7 +25322,7 @@
                 <w:b/>
                 <w:sz w:val="26"/>
               </w:rPr>
-              <w:t>GREATER PRAISE SCHOOL SYSTEM</w:t>
+              <w:t>Suahco4</w:t>
             </w:r>
           </w:p>
           <w:p>
@@ -25346,7 +25346,7 @@
                 <w:b w:val="0"/>
                 <w:sz w:val="11"/>
               </w:rPr>
-              <w:t>Phone: 0775508030/0771241726 | Email:</w:t>
+              <w:t>Phone: 0778662590 | Email:</w:t>
             </w:r>
           </w:p>
           <w:p>
@@ -25368,7 +25368,7 @@
                 <w:color w:val="B8121B"/>
                 <w:sz w:val="16"/>
               </w:rPr>
-              <w:t>Receipt No: GPSS-105</w:t>
+              <w:t>Receipt No: SUAHCO4-105</w:t>
             </w:r>
             <w:r>
               <w:rPr>
@@ -25562,7 +25562,7 @@
             <w:r>
               <w:drawing>
                 <wp:inline xmlns:a="http://schemas.openxmlformats.org/drawingml/2006/main" xmlns:pic="http://schemas.openxmlformats.org/drawingml/2006/picture">
-                  <wp:extent cx="504000" cy="340541"/>
+                  <wp:extent cx="504000" cy="216000"/>
                   <wp:docPr id="91" name="Picture 91"/>
                   <wp:cNvGraphicFramePr>
                     <a:graphicFrameLocks noChangeAspect="1"/>
@@ -25583,7 +25583,7 @@
                         <pic:spPr>
                           <a:xfrm>
                             <a:off x="0" y="0"/>
-                            <a:ext cx="504000" cy="340541"/>
+                            <a:ext cx="504000" cy="216000"/>
                           </a:xfrm>
                           <a:prstGeom prst="rect"/>
                         </pic:spPr>
@@ -25603,7 +25603,7 @@
                 <w:b/>
                 <w:sz w:val="26"/>
               </w:rPr>
-              <w:t>GREATER PRAISE SCHOOL SYSTEM</w:t>
+              <w:t>Suahco4</w:t>
             </w:r>
           </w:p>
           <w:p>
@@ -25627,7 +25627,7 @@
                 <w:b w:val="0"/>
                 <w:sz w:val="11"/>
               </w:rPr>
-              <w:t>Phone: 0775508030/0771241726 | Email:</w:t>
+              <w:t>Phone: 0778662590 | Email:</w:t>
             </w:r>
           </w:p>
           <w:p>
@@ -25649,7 +25649,7 @@
                 <w:color w:val="B8121B"/>
                 <w:sz w:val="16"/>
               </w:rPr>
-              <w:t>Receipt No: GPSS-106</w:t>
+              <w:t>Receipt No: SUAHCO4-106</w:t>
             </w:r>
             <w:r>
               <w:rPr>
@@ -25847,7 +25847,7 @@
             <w:r>
               <w:drawing>
                 <wp:inline xmlns:a="http://schemas.openxmlformats.org/drawingml/2006/main" xmlns:pic="http://schemas.openxmlformats.org/drawingml/2006/picture">
-                  <wp:extent cx="504000" cy="340541"/>
+                  <wp:extent cx="504000" cy="216000"/>
                   <wp:docPr id="92" name="Picture 92"/>
                   <wp:cNvGraphicFramePr>
                     <a:graphicFrameLocks noChangeAspect="1"/>
@@ -25868,7 +25868,7 @@
                         <pic:spPr>
                           <a:xfrm>
                             <a:off x="0" y="0"/>
-                            <a:ext cx="504000" cy="340541"/>
+                            <a:ext cx="504000" cy="216000"/>
                           </a:xfrm>
                           <a:prstGeom prst="rect"/>
                         </pic:spPr>
@@ -25888,7 +25888,7 @@
                 <w:b/>
                 <w:sz w:val="26"/>
               </w:rPr>
-              <w:t>GREATER PRAISE SCHOOL SYSTEM</w:t>
+              <w:t>Suahco4</w:t>
             </w:r>
           </w:p>
           <w:p>
@@ -25912,7 +25912,7 @@
                 <w:b w:val="0"/>
                 <w:sz w:val="11"/>
               </w:rPr>
-              <w:t>Phone: 0775508030/0771241726 | Email:</w:t>
+              <w:t>Phone: 0778662590 | Email:</w:t>
             </w:r>
           </w:p>
           <w:p>
@@ -25934,7 +25934,7 @@
                 <w:color w:val="B8121B"/>
                 <w:sz w:val="16"/>
               </w:rPr>
-              <w:t>Receipt No: GPSS-107</w:t>
+              <w:t>Receipt No: SUAHCO4-107</w:t>
             </w:r>
             <w:r>
               <w:rPr>
@@ -26132,7 +26132,7 @@
             <w:r>
               <w:drawing>
                 <wp:inline xmlns:a="http://schemas.openxmlformats.org/drawingml/2006/main" xmlns:pic="http://schemas.openxmlformats.org/drawingml/2006/picture">
-                  <wp:extent cx="504000" cy="340541"/>
+                  <wp:extent cx="504000" cy="216000"/>
                   <wp:docPr id="93" name="Picture 93"/>
                   <wp:cNvGraphicFramePr>
                     <a:graphicFrameLocks noChangeAspect="1"/>
@@ -26153,7 +26153,7 @@
                         <pic:spPr>
                           <a:xfrm>
                             <a:off x="0" y="0"/>
-                            <a:ext cx="504000" cy="340541"/>
+                            <a:ext cx="504000" cy="216000"/>
                           </a:xfrm>
                           <a:prstGeom prst="rect"/>
                         </pic:spPr>
@@ -26173,7 +26173,7 @@
                 <w:b/>
                 <w:sz w:val="26"/>
               </w:rPr>
-              <w:t>GREATER PRAISE SCHOOL SYSTEM</w:t>
+              <w:t>Suahco4</w:t>
             </w:r>
           </w:p>
           <w:p>
@@ -26197,7 +26197,7 @@
                 <w:b w:val="0"/>
                 <w:sz w:val="11"/>
               </w:rPr>
-              <w:t>Phone: 0775508030/0771241726 | Email:</w:t>
+              <w:t>Phone: 0778662590 | Email:</w:t>
             </w:r>
           </w:p>
           <w:p>
@@ -26219,7 +26219,7 @@
                 <w:color w:val="B8121B"/>
                 <w:sz w:val="16"/>
               </w:rPr>
-              <w:t>Receipt No: GPSS-108</w:t>
+              <w:t>Receipt No: SUAHCO4-108</w:t>
             </w:r>
             <w:r>
               <w:rPr>
@@ -26413,7 +26413,7 @@
             <w:r>
               <w:drawing>
                 <wp:inline xmlns:a="http://schemas.openxmlformats.org/drawingml/2006/main" xmlns:pic="http://schemas.openxmlformats.org/drawingml/2006/picture">
-                  <wp:extent cx="504000" cy="340541"/>
+                  <wp:extent cx="504000" cy="216000"/>
                   <wp:docPr id="94" name="Picture 94"/>
                   <wp:cNvGraphicFramePr>
                     <a:graphicFrameLocks noChangeAspect="1"/>
@@ -26434,7 +26434,7 @@
                         <pic:spPr>
                           <a:xfrm>
                             <a:off x="0" y="0"/>
-                            <a:ext cx="504000" cy="340541"/>
+                            <a:ext cx="504000" cy="216000"/>
                           </a:xfrm>
                           <a:prstGeom prst="rect"/>
                         </pic:spPr>
@@ -26454,7 +26454,7 @@
                 <w:b/>
                 <w:sz w:val="26"/>
               </w:rPr>
-              <w:t>GREATER PRAISE SCHOOL SYSTEM</w:t>
+              <w:t>Suahco4</w:t>
             </w:r>
           </w:p>
           <w:p>
@@ -26478,7 +26478,7 @@
                 <w:b w:val="0"/>
                 <w:sz w:val="11"/>
               </w:rPr>
-              <w:t>Phone: 0775508030/0771241726 | Email:</w:t>
+              <w:t>Phone: 0778662590 | Email:</w:t>
             </w:r>
           </w:p>
           <w:p>
@@ -26500,7 +26500,7 @@
                 <w:color w:val="B8121B"/>
                 <w:sz w:val="16"/>
               </w:rPr>
-              <w:t>Receipt No: GPSS-106</w:t>
+              <w:t>Receipt No: SUAHCO4-106</w:t>
             </w:r>
             <w:r>
               <w:rPr>
@@ -26698,7 +26698,7 @@
             <w:r>
               <w:drawing>
                 <wp:inline xmlns:a="http://schemas.openxmlformats.org/drawingml/2006/main" xmlns:pic="http://schemas.openxmlformats.org/drawingml/2006/picture">
-                  <wp:extent cx="504000" cy="340541"/>
+                  <wp:extent cx="504000" cy="216000"/>
                   <wp:docPr id="95" name="Picture 95"/>
                   <wp:cNvGraphicFramePr>
                     <a:graphicFrameLocks noChangeAspect="1"/>
@@ -26719,7 +26719,7 @@
                         <pic:spPr>
                           <a:xfrm>
                             <a:off x="0" y="0"/>
-                            <a:ext cx="504000" cy="340541"/>
+                            <a:ext cx="504000" cy="216000"/>
                           </a:xfrm>
                           <a:prstGeom prst="rect"/>
                         </pic:spPr>
@@ -26739,7 +26739,7 @@
                 <w:b/>
                 <w:sz w:val="26"/>
               </w:rPr>
-              <w:t>GREATER PRAISE SCHOOL SYSTEM</w:t>
+              <w:t>Suahco4</w:t>
             </w:r>
           </w:p>
           <w:p>
@@ -26763,7 +26763,7 @@
                 <w:b w:val="0"/>
                 <w:sz w:val="11"/>
               </w:rPr>
-              <w:t>Phone: 0775508030/0771241726 | Email:</w:t>
+              <w:t>Phone: 0778662590 | Email:</w:t>
             </w:r>
           </w:p>
           <w:p>
@@ -26785,7 +26785,7 @@
                 <w:color w:val="B8121B"/>
                 <w:sz w:val="16"/>
               </w:rPr>
-              <w:t>Receipt No: GPSS-107</w:t>
+              <w:t>Receipt No: SUAHCO4-107</w:t>
             </w:r>
             <w:r>
               <w:rPr>
@@ -26983,7 +26983,7 @@
             <w:r>
               <w:drawing>
                 <wp:inline xmlns:a="http://schemas.openxmlformats.org/drawingml/2006/main" xmlns:pic="http://schemas.openxmlformats.org/drawingml/2006/picture">
-                  <wp:extent cx="504000" cy="340541"/>
+                  <wp:extent cx="504000" cy="216000"/>
                   <wp:docPr id="96" name="Picture 96"/>
                   <wp:cNvGraphicFramePr>
                     <a:graphicFrameLocks noChangeAspect="1"/>
@@ -27004,7 +27004,7 @@
                         <pic:spPr>
                           <a:xfrm>
                             <a:off x="0" y="0"/>
-                            <a:ext cx="504000" cy="340541"/>
+                            <a:ext cx="504000" cy="216000"/>
                           </a:xfrm>
                           <a:prstGeom prst="rect"/>
                         </pic:spPr>
@@ -27024,7 +27024,7 @@
                 <w:b/>
                 <w:sz w:val="26"/>
               </w:rPr>
-              <w:t>GREATER PRAISE SCHOOL SYSTEM</w:t>
+              <w:t>Suahco4</w:t>
             </w:r>
           </w:p>
           <w:p>
@@ -27048,7 +27048,7 @@
                 <w:b w:val="0"/>
                 <w:sz w:val="11"/>
               </w:rPr>
-              <w:t>Phone: 0775508030/0771241726 | Email:</w:t>
+              <w:t>Phone: 0778662590 | Email:</w:t>
             </w:r>
           </w:p>
           <w:p>
@@ -27070,7 +27070,7 @@
                 <w:color w:val="B8121B"/>
                 <w:sz w:val="16"/>
               </w:rPr>
-              <w:t>Receipt No: GPSS-108</w:t>
+              <w:t>Receipt No: SUAHCO4-108</w:t>
             </w:r>
             <w:r>
               <w:rPr>
@@ -27264,7 +27264,7 @@
             <w:r>
               <w:drawing>
                 <wp:inline xmlns:a="http://schemas.openxmlformats.org/drawingml/2006/main" xmlns:pic="http://schemas.openxmlformats.org/drawingml/2006/picture">
-                  <wp:extent cx="504000" cy="340541"/>
+                  <wp:extent cx="504000" cy="216000"/>
                   <wp:docPr id="97" name="Picture 97"/>
                   <wp:cNvGraphicFramePr>
                     <a:graphicFrameLocks noChangeAspect="1"/>
@@ -27285,7 +27285,7 @@
                         <pic:spPr>
                           <a:xfrm>
                             <a:off x="0" y="0"/>
-                            <a:ext cx="504000" cy="340541"/>
+                            <a:ext cx="504000" cy="216000"/>
                           </a:xfrm>
                           <a:prstGeom prst="rect"/>
                         </pic:spPr>
@@ -27305,7 +27305,7 @@
                 <w:b/>
                 <w:sz w:val="26"/>
               </w:rPr>
-              <w:t>GREATER PRAISE SCHOOL SYSTEM</w:t>
+              <w:t>Suahco4</w:t>
             </w:r>
           </w:p>
           <w:p>
@@ -27329,7 +27329,7 @@
                 <w:b w:val="0"/>
                 <w:sz w:val="11"/>
               </w:rPr>
-              <w:t>Phone: 0775508030/0771241726 | Email:</w:t>
+              <w:t>Phone: 0778662590 | Email:</w:t>
             </w:r>
           </w:p>
           <w:p>
@@ -27351,7 +27351,7 @@
                 <w:color w:val="B8121B"/>
                 <w:sz w:val="16"/>
               </w:rPr>
-              <w:t>Receipt No: GPSS-109</w:t>
+              <w:t>Receipt No: SUAHCO4-109</w:t>
             </w:r>
             <w:r>
               <w:rPr>
@@ -27549,7 +27549,7 @@
             <w:r>
               <w:drawing>
                 <wp:inline xmlns:a="http://schemas.openxmlformats.org/drawingml/2006/main" xmlns:pic="http://schemas.openxmlformats.org/drawingml/2006/picture">
-                  <wp:extent cx="504000" cy="340541"/>
+                  <wp:extent cx="504000" cy="216000"/>
                   <wp:docPr id="98" name="Picture 98"/>
                   <wp:cNvGraphicFramePr>
                     <a:graphicFrameLocks noChangeAspect="1"/>
@@ -27570,7 +27570,7 @@
                         <pic:spPr>
                           <a:xfrm>
                             <a:off x="0" y="0"/>
-                            <a:ext cx="504000" cy="340541"/>
+                            <a:ext cx="504000" cy="216000"/>
                           </a:xfrm>
                           <a:prstGeom prst="rect"/>
                         </pic:spPr>
@@ -27590,7 +27590,7 @@
                 <w:b/>
                 <w:sz w:val="26"/>
               </w:rPr>
-              <w:t>GREATER PRAISE SCHOOL SYSTEM</w:t>
+              <w:t>Suahco4</w:t>
             </w:r>
           </w:p>
           <w:p>
@@ -27614,7 +27614,7 @@
                 <w:b w:val="0"/>
                 <w:sz w:val="11"/>
               </w:rPr>
-              <w:t>Phone: 0775508030/0771241726 | Email:</w:t>
+              <w:t>Phone: 0778662590 | Email:</w:t>
             </w:r>
           </w:p>
           <w:p>
@@ -27636,7 +27636,7 @@
                 <w:color w:val="B8121B"/>
                 <w:sz w:val="16"/>
               </w:rPr>
-              <w:t>Receipt No: GPSS-110</w:t>
+              <w:t>Receipt No: SUAHCO4-110</w:t>
             </w:r>
             <w:r>
               <w:rPr>
@@ -27834,7 +27834,7 @@
             <w:r>
               <w:drawing>
                 <wp:inline xmlns:a="http://schemas.openxmlformats.org/drawingml/2006/main" xmlns:pic="http://schemas.openxmlformats.org/drawingml/2006/picture">
-                  <wp:extent cx="504000" cy="340541"/>
+                  <wp:extent cx="504000" cy="216000"/>
                   <wp:docPr id="99" name="Picture 99"/>
                   <wp:cNvGraphicFramePr>
                     <a:graphicFrameLocks noChangeAspect="1"/>
@@ -27855,7 +27855,7 @@
                         <pic:spPr>
                           <a:xfrm>
                             <a:off x="0" y="0"/>
-                            <a:ext cx="504000" cy="340541"/>
+                            <a:ext cx="504000" cy="216000"/>
                           </a:xfrm>
                           <a:prstGeom prst="rect"/>
                         </pic:spPr>
@@ -27875,7 +27875,7 @@
                 <w:b/>
                 <w:sz w:val="26"/>
               </w:rPr>
-              <w:t>GREATER PRAISE SCHOOL SYSTEM</w:t>
+              <w:t>Suahco4</w:t>
             </w:r>
           </w:p>
           <w:p>
@@ -27899,7 +27899,7 @@
                 <w:b w:val="0"/>
                 <w:sz w:val="11"/>
               </w:rPr>
-              <w:t>Phone: 0775508030/0771241726 | Email:</w:t>
+              <w:t>Phone: 0778662590 | Email:</w:t>
             </w:r>
           </w:p>
           <w:p>
@@ -27921,7 +27921,7 @@
                 <w:color w:val="B8121B"/>
                 <w:sz w:val="16"/>
               </w:rPr>
-              <w:t>Receipt No: GPSS-109</w:t>
+              <w:t>Receipt No: SUAHCO4-109</w:t>
             </w:r>
             <w:r>
               <w:rPr>
@@ -28119,7 +28119,7 @@
             <w:r>
               <w:drawing>
                 <wp:inline xmlns:a="http://schemas.openxmlformats.org/drawingml/2006/main" xmlns:pic="http://schemas.openxmlformats.org/drawingml/2006/picture">
-                  <wp:extent cx="504000" cy="340541"/>
+                  <wp:extent cx="504000" cy="216000"/>
                   <wp:docPr id="100" name="Picture 100"/>
                   <wp:cNvGraphicFramePr>
                     <a:graphicFrameLocks noChangeAspect="1"/>
@@ -28140,7 +28140,7 @@
                         <pic:spPr>
                           <a:xfrm>
                             <a:off x="0" y="0"/>
-                            <a:ext cx="504000" cy="340541"/>
+                            <a:ext cx="504000" cy="216000"/>
                           </a:xfrm>
                           <a:prstGeom prst="rect"/>
                         </pic:spPr>
@@ -28160,7 +28160,7 @@
                 <w:b/>
                 <w:sz w:val="26"/>
               </w:rPr>
-              <w:t>GREATER PRAISE SCHOOL SYSTEM</w:t>
+              <w:t>Suahco4</w:t>
             </w:r>
           </w:p>
           <w:p>
@@ -28184,7 +28184,7 @@
                 <w:b w:val="0"/>
                 <w:sz w:val="11"/>
               </w:rPr>
-              <w:t>Phone: 0775508030/0771241726 | Email:</w:t>
+              <w:t>Phone: 0778662590 | Email:</w:t>
             </w:r>
           </w:p>
           <w:p>
@@ -28206,7 +28206,7 @@
                 <w:color w:val="B8121B"/>
                 <w:sz w:val="16"/>
               </w:rPr>
-              <w:t>Receipt No: GPSS-110</w:t>
+              <w:t>Receipt No: SUAHCO4-110</w:t>
             </w:r>
             <w:r>
               <w:rPr>

</xml_diff>